<commit_message>
Adiciona RA dos integrantes nas Atividades 12, 13 e 14
Lista de integrantes estava sem o RA de cada um; corrigido com os
números reais (RAs retirados do relatório oficial da Atividade 12).

Co-Authored-By: Claude Sonnet 5 <noreply@anthropic.com>
Claude-Session: https://claude.ai/code/session_018BLEsdhLyv9pz4Sfwa1pJ4
</commit_message>
<xml_diff>
--- a/garantia-qualidade-software/atividade-12/Atividade12_Bug_Hunt.docx
+++ b/garantia-qualidade-software/atividade-12/Atividade12_Bug_Hunt.docx
@@ -174,7 +174,7 @@
           <w:i w:val="0"/>
           <w:sz w:val="21"/>
         </w:rPr>
-        <w:t>Alberto da Silva</w:t>
+        <w:t>Armando José Martins Júnior — RA 12525192042</w:t>
       </w:r>
     </w:p>
     <w:p>
@@ -189,7 +189,7 @@
           <w:i w:val="0"/>
           <w:sz w:val="21"/>
         </w:rPr>
-        <w:t>Samuel Guimarães Gonçalves</w:t>
+        <w:t>Beto da Silva — RA 12525178737</w:t>
       </w:r>
     </w:p>
     <w:p>
@@ -204,7 +204,7 @@
           <w:i w:val="0"/>
           <w:sz w:val="21"/>
         </w:rPr>
-        <w:t>Armando José Martins Júnior</w:t>
+        <w:t>Samuel Guimarães Gonçalves — RA 12525151029</w:t>
       </w:r>
     </w:p>
     <w:p>
@@ -219,7 +219,7 @@
           <w:i w:val="0"/>
           <w:sz w:val="21"/>
         </w:rPr>
-        <w:t>Ian Furtado</w:t>
+        <w:t>Ian Furtado — RA 12525156081</w:t>
       </w:r>
     </w:p>
     <w:p>

</xml_diff>

<commit_message>
Padroniza visual das Atividades 12, 13 e 14 no mesmo template
Recria as Atividades 12 (conteúdo e prints reais do Armando) e 14
(conteúdo real do Samuel) no mesmo layout usado na Atividade 13
(cabeçalho UAM/Anima, mesma tipografia e tabelas), mantendo o
conteúdo técnico de cada um intacto. Os PDFs originais de cada
integrante seguem no repositório como referência.

Co-Authored-By: Claude Sonnet 5 <noreply@anthropic.com>
Claude-Session: https://claude.ai/code/session_018BLEsdhLyv9pz4Sfwa1pJ4
</commit_message>
<xml_diff>
--- a/garantia-qualidade-software/atividade-12/Atividade12_Bug_Hunt.docx
+++ b/garantia-qualidade-software/atividade-12/Atividade12_Bug_Hunt.docx
@@ -233,151 +233,7 @@
           <w:i w:val="0"/>
           <w:sz w:val="23"/>
         </w:rPr>
-        <w:t>1. Aplicação escolhida</w:t>
-      </w:r>
-    </w:p>
-    <w:p>
-      <w:pPr>
-        <w:spacing w:after="120"/>
-      </w:pPr>
-      <w:r>
-        <w:rPr>
-          <w:rFonts w:ascii="Calibri" w:hAnsi="Calibri"/>
-          <w:b/>
-          <w:i w:val="0"/>
-          <w:sz w:val="21"/>
-        </w:rPr>
-        <w:t>Sauce Demo — https://www.saucedemo.com</w:t>
-      </w:r>
-    </w:p>
-    <w:p>
-      <w:pPr>
-        <w:spacing w:after="120"/>
-      </w:pPr>
-      <w:r>
-        <w:rPr>
-          <w:rFonts w:ascii="Calibri" w:hAnsi="Calibri"/>
-          <w:b w:val="0"/>
-          <w:i w:val="0"/>
-          <w:sz w:val="21"/>
-        </w:rPr>
-        <w:t>Escolhemos o Sauce Demo porque ele já tem usuários diferentes cadastrados (standard_user, problem_user, error_user, visual_user, performance_glitch_user, locked_out_user) e cada um se comporta de um jeito diferente dentro do mesmo site. Isso deixa mais fácil achar defeito reproduzível, porque não depende de "sorte" — é só trocar de conta e o bug aparece de novo.</w:t>
-      </w:r>
-    </w:p>
-    <w:p>
-      <w:pPr>
-        <w:spacing w:before="200" w:after="80"/>
-      </w:pPr>
-      <w:r>
-        <w:rPr>
-          <w:rFonts w:ascii="Calibri" w:hAnsi="Calibri"/>
-          <w:b/>
-          <w:i w:val="0"/>
-          <w:sz w:val="23"/>
-        </w:rPr>
-        <w:t>2. Técnicas aplicadas</w:t>
-      </w:r>
-    </w:p>
-    <w:p>
-      <w:pPr>
-        <w:pStyle w:val="ListBullet"/>
-        <w:spacing w:after="40"/>
-      </w:pPr>
-      <w:r>
-        <w:rPr>
-          <w:rFonts w:ascii="Calibri" w:hAnsi="Calibri"/>
-          <w:b w:val="0"/>
-          <w:i w:val="0"/>
-          <w:sz w:val="21"/>
-        </w:rPr>
-        <w:t>Tour pela aplicação — login com cada um dos usuários disponíveis e navegação livre pelas telas de produtos, carrinho e checkout.</w:t>
-      </w:r>
-    </w:p>
-    <w:p>
-      <w:pPr>
-        <w:pStyle w:val="ListBullet"/>
-        <w:spacing w:after="40"/>
-      </w:pPr>
-      <w:r>
-        <w:rPr>
-          <w:rFonts w:ascii="Calibri" w:hAnsi="Calibri"/>
-          <w:b w:val="0"/>
-          <w:i w:val="0"/>
-          <w:sz w:val="21"/>
-        </w:rPr>
-        <w:t>Teste de fluxos alternativos — uso dos filtros de ordenação em ordens diferentes das padrões.</w:t>
-      </w:r>
-    </w:p>
-    <w:p>
-      <w:pPr>
-        <w:pStyle w:val="ListBullet"/>
-        <w:spacing w:after="40"/>
-      </w:pPr>
-      <w:r>
-        <w:rPr>
-          <w:rFonts w:ascii="Calibri" w:hAnsi="Calibri"/>
-          <w:b w:val="0"/>
-          <w:i w:val="0"/>
-          <w:sz w:val="21"/>
-        </w:rPr>
-        <w:t>Teste de limites/interrupção — preenchimento do formulário de checkout parando no meio e tentando digitar em cada campo.</w:t>
-      </w:r>
-    </w:p>
-    <w:p>
-      <w:pPr>
-        <w:pStyle w:val="ListBullet"/>
-        <w:spacing w:after="40"/>
-      </w:pPr>
-      <w:r>
-        <w:rPr>
-          <w:rFonts w:ascii="Calibri" w:hAnsi="Calibri"/>
-          <w:b w:val="0"/>
-          <w:i w:val="0"/>
-          <w:sz w:val="21"/>
-        </w:rPr>
-        <w:t>Teste de concorrência/sessão — repetir um fluxo já concluído usando o botão Voltar do navegador.</w:t>
-      </w:r>
-    </w:p>
-    <w:p>
-      <w:pPr>
-        <w:spacing w:before="200" w:after="80"/>
-      </w:pPr>
-      <w:r>
-        <w:rPr>
-          <w:rFonts w:ascii="Calibri" w:hAnsi="Calibri"/>
-          <w:b/>
-          <w:i w:val="0"/>
-          <w:sz w:val="23"/>
-        </w:rPr>
-        <w:t>3. Defeitos encontrados (5)</w:t>
-      </w:r>
-    </w:p>
-    <w:p>
-      <w:pPr>
-        <w:spacing w:after="120"/>
-      </w:pPr>
-      <w:r>
-        <w:rPr>
-          <w:rFonts w:ascii="Calibri" w:hAnsi="Calibri"/>
-          <w:b w:val="0"/>
-          <w:i w:val="0"/>
-          <w:sz w:val="21"/>
-        </w:rPr>
-        <w:t>Todos reproduzidos no mínimo duas vezes antes de registrar, pra garantir que não era coincidência de rede ou cache do navegador.</w:t>
-      </w:r>
-    </w:p>
-    <w:p>
-      <w:pPr>
-        <w:spacing w:before="200" w:after="80"/>
-      </w:pPr>
-      <w:r>
-        <w:rPr>
-          <w:rFonts w:ascii="Calibri" w:hAnsi="Calibri"/>
-          <w:b/>
-          <w:i w:val="0"/>
-          <w:sz w:val="23"/>
-        </w:rPr>
-        <w:t>BUG-001 — "Imagens dos produtos trocadas" — todos os itens mostram a mesma foto</w:t>
+        <w:t>Dados gerais</w:t>
       </w:r>
     </w:p>
     <w:tbl>
@@ -412,7 +268,7 @@
                 <w:i w:val="0"/>
                 <w:sz w:val="20"/>
               </w:rPr>
-              <w:t>Ambiente</w:t>
+              <w:t>Data</w:t>
             </w:r>
           </w:p>
         </w:tc>
@@ -428,7 +284,7 @@
                 <w:i w:val="0"/>
                 <w:sz w:val="20"/>
               </w:rPr>
-              <w:t>Windows 11, Chrome 128</w:t>
+              <w:t>02/10/2026</w:t>
             </w:r>
           </w:p>
         </w:tc>
@@ -447,7 +303,7 @@
                 <w:i w:val="0"/>
                 <w:sz w:val="20"/>
               </w:rPr>
-              <w:t>Pré-condição</w:t>
+              <w:t>Instituição / Campus</w:t>
             </w:r>
           </w:p>
         </w:tc>
@@ -463,7 +319,7 @@
                 <w:i w:val="0"/>
                 <w:sz w:val="20"/>
               </w:rPr>
-              <w:t>Login feito com o usuário problem_user (senha secret_sauce)</w:t>
+              <w:t>Universidade Anhembi Morumbi — Paulista</w:t>
             </w:r>
           </w:p>
         </w:tc>
@@ -482,7 +338,7 @@
                 <w:i w:val="0"/>
                 <w:sz w:val="20"/>
               </w:rPr>
-              <w:t>Passos para Reprodução</w:t>
+              <w:t>Período</w:t>
             </w:r>
           </w:p>
         </w:tc>
@@ -491,7 +347,6 @@
             <w:tcW w:type="dxa" w:w="6912"/>
           </w:tcPr>
           <w:p>
-            <w:r/>
             <w:r>
               <w:rPr>
                 <w:rFonts w:ascii="Calibri" w:hAnsi="Calibri"/>
@@ -499,29 +354,7 @@
                 <w:i w:val="0"/>
                 <w:sz w:val="20"/>
               </w:rPr>
-              <w:t>1. Fazer login com problem_user.</w:t>
-            </w:r>
-          </w:p>
-          <w:p>
-            <w:r>
-              <w:rPr>
-                <w:rFonts w:ascii="Calibri" w:hAnsi="Calibri"/>
-                <w:b w:val="0"/>
-                <w:i w:val="0"/>
-                <w:sz w:val="20"/>
-              </w:rPr>
-              <w:t>2. Entrar na tela "Products".</w:t>
-            </w:r>
-          </w:p>
-          <w:p>
-            <w:r>
-              <w:rPr>
-                <w:rFonts w:ascii="Calibri" w:hAnsi="Calibri"/>
-                <w:b w:val="0"/>
-                <w:i w:val="0"/>
-                <w:sz w:val="20"/>
-              </w:rPr>
-              <w:t>3. Olhar a foto de cada um dos 6 produtos do catálogo.</w:t>
+              <w:t>Noite</w:t>
             </w:r>
           </w:p>
         </w:tc>
@@ -540,7 +373,7 @@
                 <w:i w:val="0"/>
                 <w:sz w:val="20"/>
               </w:rPr>
-              <w:t>Resultado Esperado</w:t>
+              <w:t>Aplicação</w:t>
             </w:r>
           </w:p>
         </w:tc>
@@ -556,189 +389,11 @@
                 <w:i w:val="0"/>
                 <w:sz w:val="20"/>
               </w:rPr>
-              <w:t>Cada produto deveria mostrar a foto correspondente (jaqueta, mochila, camiseta, óculos, etc.)</w:t>
+              <w:t>Sauce Demo (https://www.saucedemo.com)</w:t>
             </w:r>
           </w:p>
         </w:tc>
       </w:tr>
-      <w:tr>
-        <w:tc>
-          <w:tcPr>
-            <w:tcW w:type="dxa" w:w="2304"/>
-            <w:shd w:val="clear" w:color="auto" w:fill="E7E6E6"/>
-          </w:tcPr>
-          <w:p>
-            <w:r>
-              <w:rPr>
-                <w:rFonts w:ascii="Calibri" w:hAnsi="Calibri"/>
-                <w:b/>
-                <w:i w:val="0"/>
-                <w:sz w:val="20"/>
-              </w:rPr>
-              <w:t>Resultado Obtido</w:t>
-            </w:r>
-          </w:p>
-        </w:tc>
-        <w:tc>
-          <w:tcPr>
-            <w:tcW w:type="dxa" w:w="6912"/>
-          </w:tcPr>
-          <w:p>
-            <w:r>
-              <w:rPr>
-                <w:rFonts w:ascii="Calibri" w:hAnsi="Calibri"/>
-                <w:b w:val="0"/>
-                <w:i w:val="0"/>
-                <w:sz w:val="20"/>
-              </w:rPr>
-              <w:t>Os 6 produtos aparecem todos com a mesma imagem (foto de um cachorro), sem nenhuma relação com o item</w:t>
-            </w:r>
-          </w:p>
-        </w:tc>
-      </w:tr>
-      <w:tr>
-        <w:tc>
-          <w:tcPr>
-            <w:tcW w:type="dxa" w:w="2304"/>
-            <w:shd w:val="clear" w:color="auto" w:fill="E7E6E6"/>
-          </w:tcPr>
-          <w:p>
-            <w:r>
-              <w:rPr>
-                <w:rFonts w:ascii="Calibri" w:hAnsi="Calibri"/>
-                <w:b/>
-                <w:i w:val="0"/>
-                <w:sz w:val="20"/>
-              </w:rPr>
-              <w:t>Severidade</w:t>
-            </w:r>
-          </w:p>
-        </w:tc>
-        <w:tc>
-          <w:tcPr>
-            <w:tcW w:type="dxa" w:w="6912"/>
-          </w:tcPr>
-          <w:p>
-            <w:r>
-              <w:rPr>
-                <w:rFonts w:ascii="Calibri" w:hAnsi="Calibri"/>
-                <w:b w:val="0"/>
-                <w:i w:val="0"/>
-                <w:sz w:val="20"/>
-              </w:rPr>
-              <w:t>Alta</w:t>
-            </w:r>
-          </w:p>
-        </w:tc>
-      </w:tr>
-      <w:tr>
-        <w:tc>
-          <w:tcPr>
-            <w:tcW w:type="dxa" w:w="2304"/>
-            <w:shd w:val="clear" w:color="auto" w:fill="E7E6E6"/>
-          </w:tcPr>
-          <w:p>
-            <w:r>
-              <w:rPr>
-                <w:rFonts w:ascii="Calibri" w:hAnsi="Calibri"/>
-                <w:b/>
-                <w:i w:val="0"/>
-                <w:sz w:val="20"/>
-              </w:rPr>
-              <w:t>Prioridade</w:t>
-            </w:r>
-          </w:p>
-        </w:tc>
-        <w:tc>
-          <w:tcPr>
-            <w:tcW w:type="dxa" w:w="6912"/>
-          </w:tcPr>
-          <w:p>
-            <w:r>
-              <w:rPr>
-                <w:rFonts w:ascii="Calibri" w:hAnsi="Calibri"/>
-                <w:b w:val="0"/>
-                <w:i w:val="0"/>
-                <w:sz w:val="20"/>
-              </w:rPr>
-              <w:t>Alta</w:t>
-            </w:r>
-          </w:p>
-        </w:tc>
-      </w:tr>
-      <w:tr>
-        <w:tc>
-          <w:tcPr>
-            <w:tcW w:type="dxa" w:w="2304"/>
-            <w:shd w:val="clear" w:color="auto" w:fill="E7E6E6"/>
-          </w:tcPr>
-          <w:p>
-            <w:r>
-              <w:rPr>
-                <w:rFonts w:ascii="Calibri" w:hAnsi="Calibri"/>
-                <w:b/>
-                <w:i w:val="0"/>
-                <w:sz w:val="20"/>
-              </w:rPr>
-              <w:t>Evidência</w:t>
-            </w:r>
-          </w:p>
-        </w:tc>
-        <w:tc>
-          <w:tcPr>
-            <w:tcW w:type="dxa" w:w="6912"/>
-          </w:tcPr>
-          <w:p>
-            <w:r>
-              <w:rPr>
-                <w:rFonts w:ascii="Calibri" w:hAnsi="Calibri"/>
-                <w:b w:val="0"/>
-                <w:i w:val="0"/>
-                <w:sz w:val="20"/>
-              </w:rPr>
-              <w:t>print da tela Products com as 6 imagens idênticas</w:t>
-            </w:r>
-          </w:p>
-        </w:tc>
-      </w:tr>
-    </w:tbl>
-    <w:p>
-      <w:pPr>
-        <w:spacing w:after="120"/>
-      </w:pPr>
-    </w:p>
-    <w:p>
-      <w:pPr>
-        <w:spacing w:before="200" w:after="80"/>
-      </w:pPr>
-      <w:r>
-        <w:rPr>
-          <w:rFonts w:ascii="Calibri" w:hAnsi="Calibri"/>
-          <w:b/>
-          <w:i w:val="0"/>
-          <w:sz w:val="23"/>
-        </w:rPr>
-        <w:t>BUG-002 — Ordenação "Name (Z to A)" não reordena a lista de produtos</w:t>
-      </w:r>
-    </w:p>
-    <w:tbl>
-      <w:tblPr>
-        <w:tblW w:type="auto" w:w="0"/>
-        <w:jc w:val="center"/>
-        <w:tblLook w:firstColumn="1" w:firstRow="1" w:lastColumn="0" w:lastRow="0" w:noHBand="0" w:noVBand="1" w:val="04A0"/>
-        <w:tblBorders>
-          <w:top w:val="single" w:sz="4" w:space="0" w:color="BFBFBF"/>
-          <w:left w:val="single" w:sz="4" w:space="0" w:color="BFBFBF"/>
-          <w:bottom w:val="single" w:sz="4" w:space="0" w:color="BFBFBF"/>
-          <w:right w:val="single" w:sz="4" w:space="0" w:color="BFBFBF"/>
-          <w:insideH w:val="single" w:sz="4" w:space="0" w:color="BFBFBF"/>
-          <w:insideV w:val="single" w:sz="4" w:space="0" w:color="BFBFBF"/>
-        </w:tblBorders>
-      </w:tblPr>
-      <w:tblGrid>
-        <w:gridCol w:w="4986"/>
-        <w:gridCol w:w="4986"/>
-      </w:tblGrid>
       <w:tr>
         <w:tc>
           <w:tcPr>
@@ -769,275 +424,7 @@
                 <w:i w:val="0"/>
                 <w:sz w:val="20"/>
               </w:rPr>
-              <w:t>Windows 11, Chrome 128</w:t>
-            </w:r>
-          </w:p>
-        </w:tc>
-      </w:tr>
-      <w:tr>
-        <w:tc>
-          <w:tcPr>
-            <w:tcW w:type="dxa" w:w="2304"/>
-            <w:shd w:val="clear" w:color="auto" w:fill="E7E6E6"/>
-          </w:tcPr>
-          <w:p>
-            <w:r>
-              <w:rPr>
-                <w:rFonts w:ascii="Calibri" w:hAnsi="Calibri"/>
-                <w:b/>
-                <w:i w:val="0"/>
-                <w:sz w:val="20"/>
-              </w:rPr>
-              <w:t>Pré-condição</w:t>
-            </w:r>
-          </w:p>
-        </w:tc>
-        <w:tc>
-          <w:tcPr>
-            <w:tcW w:type="dxa" w:w="6912"/>
-          </w:tcPr>
-          <w:p>
-            <w:r>
-              <w:rPr>
-                <w:rFonts w:ascii="Calibri" w:hAnsi="Calibri"/>
-                <w:b w:val="0"/>
-                <w:i w:val="0"/>
-                <w:sz w:val="20"/>
-              </w:rPr>
-              <w:t>Login com problem_user, na tela Products</w:t>
-            </w:r>
-          </w:p>
-        </w:tc>
-      </w:tr>
-      <w:tr>
-        <w:tc>
-          <w:tcPr>
-            <w:tcW w:type="dxa" w:w="2304"/>
-            <w:shd w:val="clear" w:color="auto" w:fill="E7E6E6"/>
-          </w:tcPr>
-          <w:p>
-            <w:r>
-              <w:rPr>
-                <w:rFonts w:ascii="Calibri" w:hAnsi="Calibri"/>
-                <w:b/>
-                <w:i w:val="0"/>
-                <w:sz w:val="20"/>
-              </w:rPr>
-              <w:t>Passos para Reprodução</w:t>
-            </w:r>
-          </w:p>
-        </w:tc>
-        <w:tc>
-          <w:tcPr>
-            <w:tcW w:type="dxa" w:w="6912"/>
-          </w:tcPr>
-          <w:p>
-            <w:r/>
-            <w:r>
-              <w:rPr>
-                <w:rFonts w:ascii="Calibri" w:hAnsi="Calibri"/>
-                <w:b w:val="0"/>
-                <w:i w:val="0"/>
-                <w:sz w:val="20"/>
-              </w:rPr>
-              <w:t>1. Abrir o dropdown de ordenação no canto superior esquerdo.</w:t>
-            </w:r>
-          </w:p>
-          <w:p>
-            <w:r>
-              <w:rPr>
-                <w:rFonts w:ascii="Calibri" w:hAnsi="Calibri"/>
-                <w:b w:val="0"/>
-                <w:i w:val="0"/>
-                <w:sz w:val="20"/>
-              </w:rPr>
-              <w:t>2. Selecionar a opção "Name (Z to A)".</w:t>
-            </w:r>
-          </w:p>
-          <w:p>
-            <w:r>
-              <w:rPr>
-                <w:rFonts w:ascii="Calibri" w:hAnsi="Calibri"/>
-                <w:b w:val="0"/>
-                <w:i w:val="0"/>
-                <w:sz w:val="20"/>
-              </w:rPr>
-              <w:t>3. Comparar a ordem da lista antes e depois de aplicar o filtro.</w:t>
-            </w:r>
-          </w:p>
-        </w:tc>
-      </w:tr>
-      <w:tr>
-        <w:tc>
-          <w:tcPr>
-            <w:tcW w:type="dxa" w:w="2304"/>
-            <w:shd w:val="clear" w:color="auto" w:fill="E7E6E6"/>
-          </w:tcPr>
-          <w:p>
-            <w:r>
-              <w:rPr>
-                <w:rFonts w:ascii="Calibri" w:hAnsi="Calibri"/>
-                <w:b/>
-                <w:i w:val="0"/>
-                <w:sz w:val="20"/>
-              </w:rPr>
-              <w:t>Resultado Esperado</w:t>
-            </w:r>
-          </w:p>
-        </w:tc>
-        <w:tc>
-          <w:tcPr>
-            <w:tcW w:type="dxa" w:w="6912"/>
-          </w:tcPr>
-          <w:p>
-            <w:r>
-              <w:rPr>
-                <w:rFonts w:ascii="Calibri" w:hAnsi="Calibri"/>
-                <w:b w:val="0"/>
-                <w:i w:val="0"/>
-                <w:sz w:val="20"/>
-              </w:rPr>
-              <w:t>A lista deveria reordenar os produtos de Z para A</w:t>
-            </w:r>
-          </w:p>
-        </w:tc>
-      </w:tr>
-      <w:tr>
-        <w:tc>
-          <w:tcPr>
-            <w:tcW w:type="dxa" w:w="2304"/>
-            <w:shd w:val="clear" w:color="auto" w:fill="E7E6E6"/>
-          </w:tcPr>
-          <w:p>
-            <w:r>
-              <w:rPr>
-                <w:rFonts w:ascii="Calibri" w:hAnsi="Calibri"/>
-                <w:b/>
-                <w:i w:val="0"/>
-                <w:sz w:val="20"/>
-              </w:rPr>
-              <w:t>Resultado Obtido</w:t>
-            </w:r>
-          </w:p>
-        </w:tc>
-        <w:tc>
-          <w:tcPr>
-            <w:tcW w:type="dxa" w:w="6912"/>
-          </w:tcPr>
-          <w:p>
-            <w:r>
-              <w:rPr>
-                <w:rFonts w:ascii="Calibri" w:hAnsi="Calibri"/>
-                <w:b w:val="0"/>
-                <w:i w:val="0"/>
-                <w:sz w:val="20"/>
-              </w:rPr>
-              <w:t>A lista continua exatamente na mesma ordem (A-Z), o filtro não faz nada</w:t>
-            </w:r>
-          </w:p>
-        </w:tc>
-      </w:tr>
-      <w:tr>
-        <w:tc>
-          <w:tcPr>
-            <w:tcW w:type="dxa" w:w="2304"/>
-            <w:shd w:val="clear" w:color="auto" w:fill="E7E6E6"/>
-          </w:tcPr>
-          <w:p>
-            <w:r>
-              <w:rPr>
-                <w:rFonts w:ascii="Calibri" w:hAnsi="Calibri"/>
-                <w:b/>
-                <w:i w:val="0"/>
-                <w:sz w:val="20"/>
-              </w:rPr>
-              <w:t>Severidade</w:t>
-            </w:r>
-          </w:p>
-        </w:tc>
-        <w:tc>
-          <w:tcPr>
-            <w:tcW w:type="dxa" w:w="6912"/>
-          </w:tcPr>
-          <w:p>
-            <w:r>
-              <w:rPr>
-                <w:rFonts w:ascii="Calibri" w:hAnsi="Calibri"/>
-                <w:b w:val="0"/>
-                <w:i w:val="0"/>
-                <w:sz w:val="20"/>
-              </w:rPr>
-              <w:t>Baixa</w:t>
-            </w:r>
-          </w:p>
-        </w:tc>
-      </w:tr>
-      <w:tr>
-        <w:tc>
-          <w:tcPr>
-            <w:tcW w:type="dxa" w:w="2304"/>
-            <w:shd w:val="clear" w:color="auto" w:fill="E7E6E6"/>
-          </w:tcPr>
-          <w:p>
-            <w:r>
-              <w:rPr>
-                <w:rFonts w:ascii="Calibri" w:hAnsi="Calibri"/>
-                <w:b/>
-                <w:i w:val="0"/>
-                <w:sz w:val="20"/>
-              </w:rPr>
-              <w:t>Prioridade</w:t>
-            </w:r>
-          </w:p>
-        </w:tc>
-        <w:tc>
-          <w:tcPr>
-            <w:tcW w:type="dxa" w:w="6912"/>
-          </w:tcPr>
-          <w:p>
-            <w:r>
-              <w:rPr>
-                <w:rFonts w:ascii="Calibri" w:hAnsi="Calibri"/>
-                <w:b w:val="0"/>
-                <w:i w:val="0"/>
-                <w:sz w:val="20"/>
-              </w:rPr>
-              <w:t>Baixa</w:t>
-            </w:r>
-          </w:p>
-        </w:tc>
-      </w:tr>
-      <w:tr>
-        <w:tc>
-          <w:tcPr>
-            <w:tcW w:type="dxa" w:w="2304"/>
-            <w:shd w:val="clear" w:color="auto" w:fill="E7E6E6"/>
-          </w:tcPr>
-          <w:p>
-            <w:r>
-              <w:rPr>
-                <w:rFonts w:ascii="Calibri" w:hAnsi="Calibri"/>
-                <w:b/>
-                <w:i w:val="0"/>
-                <w:sz w:val="20"/>
-              </w:rPr>
-              <w:t>Evidência</w:t>
-            </w:r>
-          </w:p>
-        </w:tc>
-        <w:tc>
-          <w:tcPr>
-            <w:tcW w:type="dxa" w:w="6912"/>
-          </w:tcPr>
-          <w:p>
-            <w:r>
-              <w:rPr>
-                <w:rFonts w:ascii="Calibri" w:hAnsi="Calibri"/>
-                <w:b w:val="0"/>
-                <w:i w:val="0"/>
-                <w:sz w:val="20"/>
-              </w:rPr>
-              <w:t>dois prints (antes e depois de aplicar o filtro) mostrando a mesma ordem</w:t>
+              <w:t>Aplicação web acessada pelo Google Chrome em Windows</w:t>
             </w:r>
           </w:p>
         </w:tc>
@@ -1059,13 +446,42 @@
           <w:i w:val="0"/>
           <w:sz w:val="23"/>
         </w:rPr>
-        <w:t>BUG-003 — Campo "Last Name" não aceita digitação na tela de Checkout</w:t>
+        <w:t>Introdução</w:t>
+      </w:r>
+    </w:p>
+    <w:p>
+      <w:pPr>
+        <w:spacing w:after="120"/>
+      </w:pPr>
+      <w:r>
+        <w:rPr>
+          <w:rFonts w:ascii="Calibri" w:hAnsi="Calibri"/>
+          <w:b w:val="0"/>
+          <w:i w:val="0"/>
+          <w:sz w:val="21"/>
+        </w:rPr>
+        <w:t>Neste relatório registramos cinco defeitos encontrados ao explorar o Sauce Demo, um e-commerce de testes. Usamos quatro perfis de usuário (standard_user, problem_user, error_user e visual_user) e aplicamos testes exploratórios: navegamos livremente pela aplicação, testamos entradas inválidas e percorremos fluxos fora do esperado. Cada defeito traz o passo a passo para reproduzir, o resultado esperado e o obtido, a classificação e as evidências.</w:t>
+      </w:r>
+    </w:p>
+    <w:p>
+      <w:pPr>
+        <w:spacing w:before="200" w:after="80"/>
+      </w:pPr>
+      <w:r>
+        <w:rPr>
+          <w:rFonts w:ascii="Calibri" w:hAnsi="Calibri"/>
+          <w:b/>
+          <w:i w:val="0"/>
+          <w:sz w:val="23"/>
+        </w:rPr>
+        <w:t>Resumo dos defeitos</w:t>
       </w:r>
     </w:p>
     <w:tbl>
       <w:tblPr>
         <w:tblW w:type="auto" w:w="0"/>
         <w:jc w:val="center"/>
+        <w:tblLayout w:type="autofit"/>
         <w:tblLook w:firstColumn="1" w:firstRow="1" w:lastColumn="0" w:lastRow="0" w:noHBand="0" w:noVBand="1" w:val="04A0"/>
         <w:tblBorders>
           <w:top w:val="single" w:sz="4" w:space="0" w:color="BFBFBF"/>
@@ -1077,16 +493,20 @@
         </w:tblBorders>
       </w:tblPr>
       <w:tblGrid>
-        <w:gridCol w:w="4986"/>
-        <w:gridCol w:w="4986"/>
+        <w:gridCol w:w="1994"/>
+        <w:gridCol w:w="1994"/>
+        <w:gridCol w:w="1994"/>
+        <w:gridCol w:w="1994"/>
+        <w:gridCol w:w="1994"/>
       </w:tblGrid>
       <w:tr>
         <w:tc>
           <w:tcPr>
-            <w:tcW w:type="dxa" w:w="2304"/>
+            <w:tcW w:type="dxa" w:w="1008"/>
             <w:shd w:val="clear" w:color="auto" w:fill="E7E6E6"/>
           </w:tcPr>
           <w:p>
+            <w:r/>
             <w:r>
               <w:rPr>
                 <w:rFonts w:ascii="Calibri" w:hAnsi="Calibri"/>
@@ -1094,34 +514,17 @@
                 <w:i w:val="0"/>
                 <w:sz w:val="20"/>
               </w:rPr>
-              <w:t>Ambiente</w:t>
+              <w:t>ID</w:t>
             </w:r>
           </w:p>
         </w:tc>
         <w:tc>
           <w:tcPr>
-            <w:tcW w:type="dxa" w:w="6912"/>
-          </w:tcPr>
-          <w:p>
-            <w:r>
-              <w:rPr>
-                <w:rFonts w:ascii="Calibri" w:hAnsi="Calibri"/>
-                <w:b w:val="0"/>
-                <w:i w:val="0"/>
-                <w:sz w:val="20"/>
-              </w:rPr>
-              <w:t>Windows 11, Chrome 128</w:t>
-            </w:r>
-          </w:p>
-        </w:tc>
-      </w:tr>
-      <w:tr>
-        <w:tc>
-          <w:tcPr>
-            <w:tcW w:type="dxa" w:w="2304"/>
+            <w:tcW w:type="dxa" w:w="1584"/>
             <w:shd w:val="clear" w:color="auto" w:fill="E7E6E6"/>
           </w:tcPr>
           <w:p>
+            <w:r/>
             <w:r>
               <w:rPr>
                 <w:rFonts w:ascii="Calibri" w:hAnsi="Calibri"/>
@@ -1129,34 +532,17 @@
                 <w:i w:val="0"/>
                 <w:sz w:val="20"/>
               </w:rPr>
-              <w:t>Pré-condição</w:t>
+              <w:t>Usuário</w:t>
             </w:r>
           </w:p>
         </w:tc>
         <w:tc>
           <w:tcPr>
-            <w:tcW w:type="dxa" w:w="6912"/>
-          </w:tcPr>
-          <w:p>
-            <w:r>
-              <w:rPr>
-                <w:rFonts w:ascii="Calibri" w:hAnsi="Calibri"/>
-                <w:b w:val="0"/>
-                <w:i w:val="0"/>
-                <w:sz w:val="20"/>
-              </w:rPr>
-              <w:t>Login com error_user, 1 item no carrinho, na tela "Checkout: Your Information"</w:t>
-            </w:r>
-          </w:p>
-        </w:tc>
-      </w:tr>
-      <w:tr>
-        <w:tc>
-          <w:tcPr>
-            <w:tcW w:type="dxa" w:w="2304"/>
+            <w:tcW w:type="dxa" w:w="4752"/>
             <w:shd w:val="clear" w:color="auto" w:fill="E7E6E6"/>
           </w:tcPr>
           <w:p>
+            <w:r/>
             <w:r>
               <w:rPr>
                 <w:rFonts w:ascii="Calibri" w:hAnsi="Calibri"/>
@@ -1164,149 +550,17 @@
                 <w:i w:val="0"/>
                 <w:sz w:val="20"/>
               </w:rPr>
-              <w:t>Passos para Reprodução</w:t>
+              <w:t>Defeito</w:t>
             </w:r>
           </w:p>
         </w:tc>
         <w:tc>
           <w:tcPr>
-            <w:tcW w:type="dxa" w:w="6912"/>
+            <w:tcW w:type="dxa" w:w="1296"/>
+            <w:shd w:val="clear" w:color="auto" w:fill="E7E6E6"/>
           </w:tcPr>
           <w:p>
             <w:r/>
-            <w:r>
-              <w:rPr>
-                <w:rFonts w:ascii="Calibri" w:hAnsi="Calibri"/>
-                <w:b w:val="0"/>
-                <w:i w:val="0"/>
-                <w:sz w:val="20"/>
-              </w:rPr>
-              <w:t>1. Fazer login com error_user.</w:t>
-            </w:r>
-          </w:p>
-          <w:p>
-            <w:r>
-              <w:rPr>
-                <w:rFonts w:ascii="Calibri" w:hAnsi="Calibri"/>
-                <w:b w:val="0"/>
-                <w:i w:val="0"/>
-                <w:sz w:val="20"/>
-              </w:rPr>
-              <w:t>2. Adicionar qualquer item ao carrinho.</w:t>
-            </w:r>
-          </w:p>
-          <w:p>
-            <w:r>
-              <w:rPr>
-                <w:rFonts w:ascii="Calibri" w:hAnsi="Calibri"/>
-                <w:b w:val="0"/>
-                <w:i w:val="0"/>
-                <w:sz w:val="20"/>
-              </w:rPr>
-              <w:t>3. Ir para o carrinho e clicar em "Checkout".</w:t>
-            </w:r>
-          </w:p>
-          <w:p>
-            <w:r>
-              <w:rPr>
-                <w:rFonts w:ascii="Calibri" w:hAnsi="Calibri"/>
-                <w:b w:val="0"/>
-                <w:i w:val="0"/>
-                <w:sz w:val="20"/>
-              </w:rPr>
-              <w:t>4. Preencher o campo "First Name" normalmente.</w:t>
-            </w:r>
-          </w:p>
-          <w:p>
-            <w:r>
-              <w:rPr>
-                <w:rFonts w:ascii="Calibri" w:hAnsi="Calibri"/>
-                <w:b w:val="0"/>
-                <w:i w:val="0"/>
-                <w:sz w:val="20"/>
-              </w:rPr>
-              <w:t>5. Clicar no campo "Last Name" e tentar digitar.</w:t>
-            </w:r>
-          </w:p>
-        </w:tc>
-      </w:tr>
-      <w:tr>
-        <w:tc>
-          <w:tcPr>
-            <w:tcW w:type="dxa" w:w="2304"/>
-            <w:shd w:val="clear" w:color="auto" w:fill="E7E6E6"/>
-          </w:tcPr>
-          <w:p>
-            <w:r>
-              <w:rPr>
-                <w:rFonts w:ascii="Calibri" w:hAnsi="Calibri"/>
-                <w:b/>
-                <w:i w:val="0"/>
-                <w:sz w:val="20"/>
-              </w:rPr>
-              <w:t>Resultado Esperado</w:t>
-            </w:r>
-          </w:p>
-        </w:tc>
-        <w:tc>
-          <w:tcPr>
-            <w:tcW w:type="dxa" w:w="6912"/>
-          </w:tcPr>
-          <w:p>
-            <w:r>
-              <w:rPr>
-                <w:rFonts w:ascii="Calibri" w:hAnsi="Calibri"/>
-                <w:b w:val="0"/>
-                <w:i w:val="0"/>
-                <w:sz w:val="20"/>
-              </w:rPr>
-              <w:t>O campo deveria aceitar o texto normalmente, permitindo continuar a compra</w:t>
-            </w:r>
-          </w:p>
-        </w:tc>
-      </w:tr>
-      <w:tr>
-        <w:tc>
-          <w:tcPr>
-            <w:tcW w:type="dxa" w:w="2304"/>
-            <w:shd w:val="clear" w:color="auto" w:fill="E7E6E6"/>
-          </w:tcPr>
-          <w:p>
-            <w:r>
-              <w:rPr>
-                <w:rFonts w:ascii="Calibri" w:hAnsi="Calibri"/>
-                <w:b/>
-                <w:i w:val="0"/>
-                <w:sz w:val="20"/>
-              </w:rPr>
-              <w:t>Resultado Obtido</w:t>
-            </w:r>
-          </w:p>
-        </w:tc>
-        <w:tc>
-          <w:tcPr>
-            <w:tcW w:type="dxa" w:w="6912"/>
-          </w:tcPr>
-          <w:p>
-            <w:r>
-              <w:rPr>
-                <w:rFonts w:ascii="Calibri" w:hAnsi="Calibri"/>
-                <w:b w:val="0"/>
-                <w:i w:val="0"/>
-                <w:sz w:val="20"/>
-              </w:rPr>
-              <w:t>O campo não reage ao clique nem à digitação — é impossível preencher e seguir para o pagamento</w:t>
-            </w:r>
-          </w:p>
-        </w:tc>
-      </w:tr>
-      <w:tr>
-        <w:tc>
-          <w:tcPr>
-            <w:tcW w:type="dxa" w:w="2304"/>
-            <w:shd w:val="clear" w:color="auto" w:fill="E7E6E6"/>
-          </w:tcPr>
-          <w:p>
             <w:r>
               <w:rPr>
                 <w:rFonts w:ascii="Calibri" w:hAnsi="Calibri"/>
@@ -1320,28 +574,11 @@
         </w:tc>
         <w:tc>
           <w:tcPr>
-            <w:tcW w:type="dxa" w:w="6912"/>
-          </w:tcPr>
-          <w:p>
-            <w:r>
-              <w:rPr>
-                <w:rFonts w:ascii="Calibri" w:hAnsi="Calibri"/>
-                <w:b w:val="0"/>
-                <w:i w:val="0"/>
-                <w:sz w:val="20"/>
-              </w:rPr>
-              <w:t>Crítica</w:t>
-            </w:r>
-          </w:p>
-        </w:tc>
-      </w:tr>
-      <w:tr>
-        <w:tc>
-          <w:tcPr>
-            <w:tcW w:type="dxa" w:w="2304"/>
+            <w:tcW w:type="dxa" w:w="1296"/>
             <w:shd w:val="clear" w:color="auto" w:fill="E7E6E6"/>
           </w:tcPr>
           <w:p>
+            <w:r/>
             <w:r>
               <w:rPr>
                 <w:rFonts w:ascii="Calibri" w:hAnsi="Calibri"/>
@@ -1353,11 +590,169 @@
             </w:r>
           </w:p>
         </w:tc>
+      </w:tr>
+      <w:tr>
         <w:tc>
           <w:tcPr>
-            <w:tcW w:type="dxa" w:w="6912"/>
+            <w:tcW w:type="dxa" w:w="1008"/>
           </w:tcPr>
           <w:p>
+            <w:r/>
+            <w:r>
+              <w:rPr>
+                <w:rFonts w:ascii="Calibri" w:hAnsi="Calibri"/>
+                <w:b w:val="0"/>
+                <w:i w:val="0"/>
+                <w:sz w:val="20"/>
+              </w:rPr>
+              <w:t>BUG-001</w:t>
+            </w:r>
+          </w:p>
+        </w:tc>
+        <w:tc>
+          <w:tcPr>
+            <w:tcW w:type="dxa" w:w="1584"/>
+          </w:tcPr>
+          <w:p>
+            <w:r/>
+            <w:r>
+              <w:rPr>
+                <w:rFonts w:ascii="Calibri" w:hAnsi="Calibri"/>
+                <w:b w:val="0"/>
+                <w:i w:val="0"/>
+                <w:sz w:val="20"/>
+              </w:rPr>
+              <w:t>standard_user</w:t>
+            </w:r>
+          </w:p>
+        </w:tc>
+        <w:tc>
+          <w:tcPr>
+            <w:tcW w:type="dxa" w:w="4752"/>
+          </w:tcPr>
+          <w:p>
+            <w:r/>
+            <w:r>
+              <w:rPr>
+                <w:rFonts w:ascii="Calibri" w:hAnsi="Calibri"/>
+                <w:b w:val="0"/>
+                <w:i w:val="0"/>
+                <w:sz w:val="20"/>
+              </w:rPr>
+              <w:t>Campo de CEP aceita caracteres alfabéticos</w:t>
+            </w:r>
+          </w:p>
+        </w:tc>
+        <w:tc>
+          <w:tcPr>
+            <w:tcW w:type="dxa" w:w="1296"/>
+          </w:tcPr>
+          <w:p>
+            <w:r/>
+            <w:r>
+              <w:rPr>
+                <w:rFonts w:ascii="Calibri" w:hAnsi="Calibri"/>
+                <w:b w:val="0"/>
+                <w:i w:val="0"/>
+                <w:sz w:val="20"/>
+              </w:rPr>
+              <w:t>Média</w:t>
+            </w:r>
+          </w:p>
+        </w:tc>
+        <w:tc>
+          <w:tcPr>
+            <w:tcW w:type="dxa" w:w="1296"/>
+          </w:tcPr>
+          <w:p>
+            <w:r/>
+            <w:r>
+              <w:rPr>
+                <w:rFonts w:ascii="Calibri" w:hAnsi="Calibri"/>
+                <w:b w:val="0"/>
+                <w:i w:val="0"/>
+                <w:sz w:val="20"/>
+              </w:rPr>
+              <w:t>Média</w:t>
+            </w:r>
+          </w:p>
+        </w:tc>
+      </w:tr>
+      <w:tr>
+        <w:tc>
+          <w:tcPr>
+            <w:tcW w:type="dxa" w:w="1008"/>
+          </w:tcPr>
+          <w:p>
+            <w:r/>
+            <w:r>
+              <w:rPr>
+                <w:rFonts w:ascii="Calibri" w:hAnsi="Calibri"/>
+                <w:b w:val="0"/>
+                <w:i w:val="0"/>
+                <w:sz w:val="20"/>
+              </w:rPr>
+              <w:t>BUG-002</w:t>
+            </w:r>
+          </w:p>
+        </w:tc>
+        <w:tc>
+          <w:tcPr>
+            <w:tcW w:type="dxa" w:w="1584"/>
+          </w:tcPr>
+          <w:p>
+            <w:r/>
+            <w:r>
+              <w:rPr>
+                <w:rFonts w:ascii="Calibri" w:hAnsi="Calibri"/>
+                <w:b w:val="0"/>
+                <w:i w:val="0"/>
+                <w:sz w:val="20"/>
+              </w:rPr>
+              <w:t>standard_user</w:t>
+            </w:r>
+          </w:p>
+        </w:tc>
+        <w:tc>
+          <w:tcPr>
+            <w:tcW w:type="dxa" w:w="4752"/>
+          </w:tcPr>
+          <w:p>
+            <w:r/>
+            <w:r>
+              <w:rPr>
+                <w:rFonts w:ascii="Calibri" w:hAnsi="Calibri"/>
+                <w:b w:val="0"/>
+                <w:i w:val="0"/>
+                <w:sz w:val="20"/>
+              </w:rPr>
+              <w:t>Checkout pode ser concluído com carrinho vazio</w:t>
+            </w:r>
+          </w:p>
+        </w:tc>
+        <w:tc>
+          <w:tcPr>
+            <w:tcW w:type="dxa" w:w="1296"/>
+          </w:tcPr>
+          <w:p>
+            <w:r/>
+            <w:r>
+              <w:rPr>
+                <w:rFonts w:ascii="Calibri" w:hAnsi="Calibri"/>
+                <w:b w:val="0"/>
+                <w:i w:val="0"/>
+                <w:sz w:val="20"/>
+              </w:rPr>
+              <w:t>Alta</w:t>
+            </w:r>
+          </w:p>
+        </w:tc>
+        <w:tc>
+          <w:tcPr>
+            <w:tcW w:type="dxa" w:w="1296"/>
+          </w:tcPr>
+          <w:p>
+            <w:r/>
             <w:r>
               <w:rPr>
                 <w:rFonts w:ascii="Calibri" w:hAnsi="Calibri"/>
@@ -1373,167 +768,7 @@
       <w:tr>
         <w:tc>
           <w:tcPr>
-            <w:tcW w:type="dxa" w:w="2304"/>
-            <w:shd w:val="clear" w:color="auto" w:fill="E7E6E6"/>
-          </w:tcPr>
-          <w:p>
-            <w:r>
-              <w:rPr>
-                <w:rFonts w:ascii="Calibri" w:hAnsi="Calibri"/>
-                <w:b/>
-                <w:i w:val="0"/>
-                <w:sz w:val="20"/>
-              </w:rPr>
-              <w:t>Evidência</w:t>
-            </w:r>
-          </w:p>
-        </w:tc>
-        <w:tc>
-          <w:tcPr>
-            <w:tcW w:type="dxa" w:w="6912"/>
-          </w:tcPr>
-          <w:p>
-            <w:r>
-              <w:rPr>
-                <w:rFonts w:ascii="Calibri" w:hAnsi="Calibri"/>
-                <w:b w:val="0"/>
-                <w:i w:val="0"/>
-                <w:sz w:val="20"/>
-              </w:rPr>
-              <w:t>vídeo curto mostrando o cursor piscando no campo sem nenhum caractere sendo digitado</w:t>
-            </w:r>
-          </w:p>
-        </w:tc>
-      </w:tr>
-    </w:tbl>
-    <w:p>
-      <w:pPr>
-        <w:spacing w:after="120"/>
-      </w:pPr>
-    </w:p>
-    <w:p>
-      <w:pPr>
-        <w:spacing w:before="200" w:after="80"/>
-      </w:pPr>
-      <w:r>
-        <w:rPr>
-          <w:rFonts w:ascii="Calibri" w:hAnsi="Calibri"/>
-          <w:b/>
-          <w:i w:val="0"/>
-          <w:sz w:val="23"/>
-        </w:rPr>
-        <w:t>BUG-004 — Layout quebrado na tela de produtos</w:t>
-      </w:r>
-    </w:p>
-    <w:tbl>
-      <w:tblPr>
-        <w:tblW w:type="auto" w:w="0"/>
-        <w:jc w:val="center"/>
-        <w:tblLook w:firstColumn="1" w:firstRow="1" w:lastColumn="0" w:lastRow="0" w:noHBand="0" w:noVBand="1" w:val="04A0"/>
-        <w:tblBorders>
-          <w:top w:val="single" w:sz="4" w:space="0" w:color="BFBFBF"/>
-          <w:left w:val="single" w:sz="4" w:space="0" w:color="BFBFBF"/>
-          <w:bottom w:val="single" w:sz="4" w:space="0" w:color="BFBFBF"/>
-          <w:right w:val="single" w:sz="4" w:space="0" w:color="BFBFBF"/>
-          <w:insideH w:val="single" w:sz="4" w:space="0" w:color="BFBFBF"/>
-          <w:insideV w:val="single" w:sz="4" w:space="0" w:color="BFBFBF"/>
-        </w:tblBorders>
-      </w:tblPr>
-      <w:tblGrid>
-        <w:gridCol w:w="4986"/>
-        <w:gridCol w:w="4986"/>
-      </w:tblGrid>
-      <w:tr>
-        <w:tc>
-          <w:tcPr>
-            <w:tcW w:type="dxa" w:w="2304"/>
-            <w:shd w:val="clear" w:color="auto" w:fill="E7E6E6"/>
-          </w:tcPr>
-          <w:p>
-            <w:r>
-              <w:rPr>
-                <w:rFonts w:ascii="Calibri" w:hAnsi="Calibri"/>
-                <w:b/>
-                <w:i w:val="0"/>
-                <w:sz w:val="20"/>
-              </w:rPr>
-              <w:t>Ambiente</w:t>
-            </w:r>
-          </w:p>
-        </w:tc>
-        <w:tc>
-          <w:tcPr>
-            <w:tcW w:type="dxa" w:w="6912"/>
-          </w:tcPr>
-          <w:p>
-            <w:r>
-              <w:rPr>
-                <w:rFonts w:ascii="Calibri" w:hAnsi="Calibri"/>
-                <w:b w:val="0"/>
-                <w:i w:val="0"/>
-                <w:sz w:val="20"/>
-              </w:rPr>
-              <w:t>Windows 11, Chrome 128</w:t>
-            </w:r>
-          </w:p>
-        </w:tc>
-      </w:tr>
-      <w:tr>
-        <w:tc>
-          <w:tcPr>
-            <w:tcW w:type="dxa" w:w="2304"/>
-            <w:shd w:val="clear" w:color="auto" w:fill="E7E6E6"/>
-          </w:tcPr>
-          <w:p>
-            <w:r>
-              <w:rPr>
-                <w:rFonts w:ascii="Calibri" w:hAnsi="Calibri"/>
-                <w:b/>
-                <w:i w:val="0"/>
-                <w:sz w:val="20"/>
-              </w:rPr>
-              <w:t>Pré-condição</w:t>
-            </w:r>
-          </w:p>
-        </w:tc>
-        <w:tc>
-          <w:tcPr>
-            <w:tcW w:type="dxa" w:w="6912"/>
-          </w:tcPr>
-          <w:p>
-            <w:r>
-              <w:rPr>
-                <w:rFonts w:ascii="Calibri" w:hAnsi="Calibri"/>
-                <w:b w:val="0"/>
-                <w:i w:val="0"/>
-                <w:sz w:val="20"/>
-              </w:rPr>
-              <w:t>Login com visual_user</w:t>
-            </w:r>
-          </w:p>
-        </w:tc>
-      </w:tr>
-      <w:tr>
-        <w:tc>
-          <w:tcPr>
-            <w:tcW w:type="dxa" w:w="2304"/>
-            <w:shd w:val="clear" w:color="auto" w:fill="E7E6E6"/>
-          </w:tcPr>
-          <w:p>
-            <w:r>
-              <w:rPr>
-                <w:rFonts w:ascii="Calibri" w:hAnsi="Calibri"/>
-                <w:b/>
-                <w:i w:val="0"/>
-                <w:sz w:val="20"/>
-              </w:rPr>
-              <w:t>Passos para Reprodução</w:t>
-            </w:r>
-          </w:p>
-        </w:tc>
-        <w:tc>
-          <w:tcPr>
-            <w:tcW w:type="dxa" w:w="6912"/>
+            <w:tcW w:type="dxa" w:w="1008"/>
           </w:tcPr>
           <w:p>
             <w:r/>
@@ -1544,10 +779,16 @@
                 <w:i w:val="0"/>
                 <w:sz w:val="20"/>
               </w:rPr>
-              <w:t>1. Fazer login com visual_user.</w:t>
+              <w:t>BUG-003</w:t>
             </w:r>
           </w:p>
+        </w:tc>
+        <w:tc>
+          <w:tcPr>
+            <w:tcW w:type="dxa" w:w="1584"/>
+          </w:tcPr>
           <w:p>
+            <w:r/>
             <w:r>
               <w:rPr>
                 <w:rFonts w:ascii="Calibri" w:hAnsi="Calibri"/>
@@ -1555,10 +796,16 @@
                 <w:i w:val="0"/>
                 <w:sz w:val="20"/>
               </w:rPr>
-              <w:t>2. Entrar na tela "Products".</w:t>
+              <w:t>problem_user</w:t>
             </w:r>
           </w:p>
+        </w:tc>
+        <w:tc>
+          <w:tcPr>
+            <w:tcW w:type="dxa" w:w="4752"/>
+          </w:tcPr>
           <w:p>
+            <w:r/>
             <w:r>
               <w:rPr>
                 <w:rFonts w:ascii="Calibri" w:hAnsi="Calibri"/>
@@ -1566,34 +813,16 @@
                 <w:i w:val="0"/>
                 <w:sz w:val="20"/>
               </w:rPr>
-              <w:t>3. Observar o alinhamento dos cards de produto.</w:t>
-            </w:r>
-          </w:p>
-        </w:tc>
-      </w:tr>
-      <w:tr>
-        <w:tc>
-          <w:tcPr>
-            <w:tcW w:type="dxa" w:w="2304"/>
-            <w:shd w:val="clear" w:color="auto" w:fill="E7E6E6"/>
-          </w:tcPr>
-          <w:p>
-            <w:r>
-              <w:rPr>
-                <w:rFonts w:ascii="Calibri" w:hAnsi="Calibri"/>
-                <w:b/>
-                <w:i w:val="0"/>
-                <w:sz w:val="20"/>
-              </w:rPr>
-              <w:t>Resultado Esperado</w:t>
+              <w:t>Todos os produtos exibem a mesma imagem (cachorro)</w:t>
             </w:r>
           </w:p>
         </w:tc>
         <w:tc>
           <w:tcPr>
-            <w:tcW w:type="dxa" w:w="6912"/>
+            <w:tcW w:type="dxa" w:w="1296"/>
           </w:tcPr>
           <w:p>
+            <w:r/>
             <w:r>
               <w:rPr>
                 <w:rFonts w:ascii="Calibri" w:hAnsi="Calibri"/>
@@ -1601,69 +830,16 @@
                 <w:i w:val="0"/>
                 <w:sz w:val="20"/>
               </w:rPr>
-              <w:t>Grid de produtos alinhado, igual ao que aparece para o standard_user</w:t>
-            </w:r>
-          </w:p>
-        </w:tc>
-      </w:tr>
-      <w:tr>
-        <w:tc>
-          <w:tcPr>
-            <w:tcW w:type="dxa" w:w="2304"/>
-            <w:shd w:val="clear" w:color="auto" w:fill="E7E6E6"/>
-          </w:tcPr>
-          <w:p>
-            <w:r>
-              <w:rPr>
-                <w:rFonts w:ascii="Calibri" w:hAnsi="Calibri"/>
-                <w:b/>
-                <w:i w:val="0"/>
-                <w:sz w:val="20"/>
-              </w:rPr>
-              <w:t>Resultado Obtido</w:t>
+              <w:t>Média</w:t>
             </w:r>
           </w:p>
         </w:tc>
         <w:tc>
           <w:tcPr>
-            <w:tcW w:type="dxa" w:w="6912"/>
+            <w:tcW w:type="dxa" w:w="1296"/>
           </w:tcPr>
           <w:p>
-            <w:r>
-              <w:rPr>
-                <w:rFonts w:ascii="Calibri" w:hAnsi="Calibri"/>
-                <w:b w:val="0"/>
-                <w:i w:val="0"/>
-                <w:sz w:val="20"/>
-              </w:rPr>
-              <w:t>As imagens aparecem em tamanhos diferentes entre si, sobrepondo o texto e, em alguns cards, cobrindo parte do botão "Add to cart"</w:t>
-            </w:r>
-          </w:p>
-        </w:tc>
-      </w:tr>
-      <w:tr>
-        <w:tc>
-          <w:tcPr>
-            <w:tcW w:type="dxa" w:w="2304"/>
-            <w:shd w:val="clear" w:color="auto" w:fill="E7E6E6"/>
-          </w:tcPr>
-          <w:p>
-            <w:r>
-              <w:rPr>
-                <w:rFonts w:ascii="Calibri" w:hAnsi="Calibri"/>
-                <w:b/>
-                <w:i w:val="0"/>
-                <w:sz w:val="20"/>
-              </w:rPr>
-              <w:t>Severidade</w:t>
-            </w:r>
-          </w:p>
-        </w:tc>
-        <w:tc>
-          <w:tcPr>
-            <w:tcW w:type="dxa" w:w="6912"/>
-          </w:tcPr>
-          <w:p>
+            <w:r/>
             <w:r>
               <w:rPr>
                 <w:rFonts w:ascii="Calibri" w:hAnsi="Calibri"/>
@@ -1679,26 +855,78 @@
       <w:tr>
         <w:tc>
           <w:tcPr>
-            <w:tcW w:type="dxa" w:w="2304"/>
-            <w:shd w:val="clear" w:color="auto" w:fill="E7E6E6"/>
+            <w:tcW w:type="dxa" w:w="1008"/>
           </w:tcPr>
           <w:p>
+            <w:r/>
             <w:r>
               <w:rPr>
                 <w:rFonts w:ascii="Calibri" w:hAnsi="Calibri"/>
-                <w:b/>
+                <w:b w:val="0"/>
                 <w:i w:val="0"/>
                 <w:sz w:val="20"/>
               </w:rPr>
-              <w:t>Prioridade</w:t>
+              <w:t>BUG-004</w:t>
             </w:r>
           </w:p>
         </w:tc>
         <w:tc>
           <w:tcPr>
-            <w:tcW w:type="dxa" w:w="6912"/>
+            <w:tcW w:type="dxa" w:w="1584"/>
           </w:tcPr>
           <w:p>
+            <w:r/>
+            <w:r>
+              <w:rPr>
+                <w:rFonts w:ascii="Calibri" w:hAnsi="Calibri"/>
+                <w:b w:val="0"/>
+                <w:i w:val="0"/>
+                <w:sz w:val="20"/>
+              </w:rPr>
+              <w:t>error_user</w:t>
+            </w:r>
+          </w:p>
+        </w:tc>
+        <w:tc>
+          <w:tcPr>
+            <w:tcW w:type="dxa" w:w="4752"/>
+          </w:tcPr>
+          <w:p>
+            <w:r/>
+            <w:r>
+              <w:rPr>
+                <w:rFonts w:ascii="Calibri" w:hAnsi="Calibri"/>
+                <w:b w:val="0"/>
+                <w:i w:val="0"/>
+                <w:sz w:val="20"/>
+              </w:rPr>
+              <w:t>Descrição do produto não é exibida na página de detalhes</w:t>
+            </w:r>
+          </w:p>
+        </w:tc>
+        <w:tc>
+          <w:tcPr>
+            <w:tcW w:type="dxa" w:w="1296"/>
+          </w:tcPr>
+          <w:p>
+            <w:r/>
+            <w:r>
+              <w:rPr>
+                <w:rFonts w:ascii="Calibri" w:hAnsi="Calibri"/>
+                <w:b w:val="0"/>
+                <w:i w:val="0"/>
+                <w:sz w:val="20"/>
+              </w:rPr>
+              <w:t>Média</w:t>
+            </w:r>
+          </w:p>
+        </w:tc>
+        <w:tc>
+          <w:tcPr>
+            <w:tcW w:type="dxa" w:w="1296"/>
+          </w:tcPr>
+          <w:p>
+            <w:r/>
             <w:r>
               <w:rPr>
                 <w:rFonts w:ascii="Calibri" w:hAnsi="Calibri"/>
@@ -1714,26 +942,10 @@
       <w:tr>
         <w:tc>
           <w:tcPr>
-            <w:tcW w:type="dxa" w:w="2304"/>
-            <w:shd w:val="clear" w:color="auto" w:fill="E7E6E6"/>
+            <w:tcW w:type="dxa" w:w="1008"/>
           </w:tcPr>
           <w:p>
-            <w:r>
-              <w:rPr>
-                <w:rFonts w:ascii="Calibri" w:hAnsi="Calibri"/>
-                <w:b/>
-                <w:i w:val="0"/>
-                <w:sz w:val="20"/>
-              </w:rPr>
-              <w:t>Evidência</w:t>
-            </w:r>
-          </w:p>
-        </w:tc>
-        <w:tc>
-          <w:tcPr>
-            <w:tcW w:type="dxa" w:w="6912"/>
-          </w:tcPr>
-          <w:p>
+            <w:r/>
             <w:r>
               <w:rPr>
                 <w:rFonts w:ascii="Calibri" w:hAnsi="Calibri"/>
@@ -1741,7 +953,75 @@
                 <w:i w:val="0"/>
                 <w:sz w:val="20"/>
               </w:rPr>
-              <w:t>print da tela Products com o grid desalinhado</w:t>
+              <w:t>BUG-005</w:t>
+            </w:r>
+          </w:p>
+        </w:tc>
+        <w:tc>
+          <w:tcPr>
+            <w:tcW w:type="dxa" w:w="1584"/>
+          </w:tcPr>
+          <w:p>
+            <w:r/>
+            <w:r>
+              <w:rPr>
+                <w:rFonts w:ascii="Calibri" w:hAnsi="Calibri"/>
+                <w:b w:val="0"/>
+                <w:i w:val="0"/>
+                <w:sz w:val="20"/>
+              </w:rPr>
+              <w:t>visual_user</w:t>
+            </w:r>
+          </w:p>
+        </w:tc>
+        <w:tc>
+          <w:tcPr>
+            <w:tcW w:type="dxa" w:w="4752"/>
+          </w:tcPr>
+          <w:p>
+            <w:r/>
+            <w:r>
+              <w:rPr>
+                <w:rFonts w:ascii="Calibri" w:hAnsi="Calibri"/>
+                <w:b w:val="0"/>
+                <w:i w:val="0"/>
+                <w:sz w:val="20"/>
+              </w:rPr>
+              <w:t>Preços, imagem e layout inconsistentes na listagem</w:t>
+            </w:r>
+          </w:p>
+        </w:tc>
+        <w:tc>
+          <w:tcPr>
+            <w:tcW w:type="dxa" w:w="1296"/>
+          </w:tcPr>
+          <w:p>
+            <w:r/>
+            <w:r>
+              <w:rPr>
+                <w:rFonts w:ascii="Calibri" w:hAnsi="Calibri"/>
+                <w:b w:val="0"/>
+                <w:i w:val="0"/>
+                <w:sz w:val="20"/>
+              </w:rPr>
+              <w:t>Média</w:t>
+            </w:r>
+          </w:p>
+        </w:tc>
+        <w:tc>
+          <w:tcPr>
+            <w:tcW w:type="dxa" w:w="1296"/>
+          </w:tcPr>
+          <w:p>
+            <w:r/>
+            <w:r>
+              <w:rPr>
+                <w:rFonts w:ascii="Calibri" w:hAnsi="Calibri"/>
+                <w:b w:val="0"/>
+                <w:i w:val="0"/>
+                <w:sz w:val="20"/>
+              </w:rPr>
+              <w:t>Média</w:t>
             </w:r>
           </w:p>
         </w:tc>
@@ -1749,8 +1029,22 @@
     </w:tbl>
     <w:p>
       <w:pPr>
+        <w:spacing w:after="80"/>
+      </w:pPr>
+    </w:p>
+    <w:p>
+      <w:pPr>
         <w:spacing w:after="120"/>
       </w:pPr>
+      <w:r>
+        <w:rPr>
+          <w:rFonts w:ascii="Calibri" w:hAnsi="Calibri"/>
+          <w:b w:val="0"/>
+          <w:i/>
+          <w:sz w:val="21"/>
+        </w:rPr>
+        <w:t>Critérios utilizados: a severidade representa o impacto técnico observado no funcionamento da aplicação. A prioridade representa a urgência atribuída à correção dentro deste relatório. Os níveis foram definidos de forma qualitativa, a partir do impacto e da possibilidade de o defeito bloquear ou comprometer o fluxo testado.</w:t>
+      </w:r>
     </w:p>
     <w:p>
       <w:pPr>
@@ -1763,355 +1057,12 @@
           <w:i w:val="0"/>
           <w:sz w:val="23"/>
         </w:rPr>
-        <w:t>BUG-005 — Botão "Voltar" do navegador reexibe a tela de pedido já finalizado</w:t>
+        <w:t>BUG-001 — Campo de CEP aceita caracteres alfabéticos</w:t>
       </w:r>
     </w:p>
     <w:tbl>
       <w:tblPr>
         <w:tblW w:type="auto" w:w="0"/>
-        <w:jc w:val="center"/>
-        <w:tblLook w:firstColumn="1" w:firstRow="1" w:lastColumn="0" w:lastRow="0" w:noHBand="0" w:noVBand="1" w:val="04A0"/>
-        <w:tblBorders>
-          <w:top w:val="single" w:sz="4" w:space="0" w:color="BFBFBF"/>
-          <w:left w:val="single" w:sz="4" w:space="0" w:color="BFBFBF"/>
-          <w:bottom w:val="single" w:sz="4" w:space="0" w:color="BFBFBF"/>
-          <w:right w:val="single" w:sz="4" w:space="0" w:color="BFBFBF"/>
-          <w:insideH w:val="single" w:sz="4" w:space="0" w:color="BFBFBF"/>
-          <w:insideV w:val="single" w:sz="4" w:space="0" w:color="BFBFBF"/>
-        </w:tblBorders>
-      </w:tblPr>
-      <w:tblGrid>
-        <w:gridCol w:w="4986"/>
-        <w:gridCol w:w="4986"/>
-      </w:tblGrid>
-      <w:tr>
-        <w:tc>
-          <w:tcPr>
-            <w:tcW w:type="dxa" w:w="2304"/>
-            <w:shd w:val="clear" w:color="auto" w:fill="E7E6E6"/>
-          </w:tcPr>
-          <w:p>
-            <w:r>
-              <w:rPr>
-                <w:rFonts w:ascii="Calibri" w:hAnsi="Calibri"/>
-                <w:b/>
-                <w:i w:val="0"/>
-                <w:sz w:val="20"/>
-              </w:rPr>
-              <w:t>Ambiente</w:t>
-            </w:r>
-          </w:p>
-        </w:tc>
-        <w:tc>
-          <w:tcPr>
-            <w:tcW w:type="dxa" w:w="6912"/>
-          </w:tcPr>
-          <w:p>
-            <w:r>
-              <w:rPr>
-                <w:rFonts w:ascii="Calibri" w:hAnsi="Calibri"/>
-                <w:b w:val="0"/>
-                <w:i w:val="0"/>
-                <w:sz w:val="20"/>
-              </w:rPr>
-              <w:t>Windows 11, Chrome 128</w:t>
-            </w:r>
-          </w:p>
-        </w:tc>
-      </w:tr>
-      <w:tr>
-        <w:tc>
-          <w:tcPr>
-            <w:tcW w:type="dxa" w:w="2304"/>
-            <w:shd w:val="clear" w:color="auto" w:fill="E7E6E6"/>
-          </w:tcPr>
-          <w:p>
-            <w:r>
-              <w:rPr>
-                <w:rFonts w:ascii="Calibri" w:hAnsi="Calibri"/>
-                <w:b/>
-                <w:i w:val="0"/>
-                <w:sz w:val="20"/>
-              </w:rPr>
-              <w:t>Pré-condição</w:t>
-            </w:r>
-          </w:p>
-        </w:tc>
-        <w:tc>
-          <w:tcPr>
-            <w:tcW w:type="dxa" w:w="6912"/>
-          </w:tcPr>
-          <w:p>
-            <w:r>
-              <w:rPr>
-                <w:rFonts w:ascii="Calibri" w:hAnsi="Calibri"/>
-                <w:b w:val="0"/>
-                <w:i w:val="0"/>
-                <w:sz w:val="20"/>
-              </w:rPr>
-              <w:t>Login com standard_user, compra finalizada até a tela "Checkout: Complete!"</w:t>
-            </w:r>
-          </w:p>
-        </w:tc>
-      </w:tr>
-      <w:tr>
-        <w:tc>
-          <w:tcPr>
-            <w:tcW w:type="dxa" w:w="2304"/>
-            <w:shd w:val="clear" w:color="auto" w:fill="E7E6E6"/>
-          </w:tcPr>
-          <w:p>
-            <w:r>
-              <w:rPr>
-                <w:rFonts w:ascii="Calibri" w:hAnsi="Calibri"/>
-                <w:b/>
-                <w:i w:val="0"/>
-                <w:sz w:val="20"/>
-              </w:rPr>
-              <w:t>Passos para Reprodução</w:t>
-            </w:r>
-          </w:p>
-        </w:tc>
-        <w:tc>
-          <w:tcPr>
-            <w:tcW w:type="dxa" w:w="6912"/>
-          </w:tcPr>
-          <w:p>
-            <w:r/>
-            <w:r>
-              <w:rPr>
-                <w:rFonts w:ascii="Calibri" w:hAnsi="Calibri"/>
-                <w:b w:val="0"/>
-                <w:i w:val="0"/>
-                <w:sz w:val="20"/>
-              </w:rPr>
-              <w:t>1. Fazer login e finalizar uma compra normalmente até a tela "Checkout: Complete!".</w:t>
-            </w:r>
-          </w:p>
-          <w:p>
-            <w:r>
-              <w:rPr>
-                <w:rFonts w:ascii="Calibri" w:hAnsi="Calibri"/>
-                <w:b w:val="0"/>
-                <w:i w:val="0"/>
-                <w:sz w:val="20"/>
-              </w:rPr>
-              <w:t>2. Clicar em "Back Home".</w:t>
-            </w:r>
-          </w:p>
-          <w:p>
-            <w:r>
-              <w:rPr>
-                <w:rFonts w:ascii="Calibri" w:hAnsi="Calibri"/>
-                <w:b w:val="0"/>
-                <w:i w:val="0"/>
-                <w:sz w:val="20"/>
-              </w:rPr>
-              <w:t>3. Clicar no botão Voltar do navegador.</w:t>
-            </w:r>
-          </w:p>
-        </w:tc>
-      </w:tr>
-      <w:tr>
-        <w:tc>
-          <w:tcPr>
-            <w:tcW w:type="dxa" w:w="2304"/>
-            <w:shd w:val="clear" w:color="auto" w:fill="E7E6E6"/>
-          </w:tcPr>
-          <w:p>
-            <w:r>
-              <w:rPr>
-                <w:rFonts w:ascii="Calibri" w:hAnsi="Calibri"/>
-                <w:b/>
-                <w:i w:val="0"/>
-                <w:sz w:val="20"/>
-              </w:rPr>
-              <w:t>Resultado Esperado</w:t>
-            </w:r>
-          </w:p>
-        </w:tc>
-        <w:tc>
-          <w:tcPr>
-            <w:tcW w:type="dxa" w:w="6912"/>
-          </w:tcPr>
-          <w:p>
-            <w:r>
-              <w:rPr>
-                <w:rFonts w:ascii="Calibri" w:hAnsi="Calibri"/>
-                <w:b w:val="0"/>
-                <w:i w:val="0"/>
-                <w:sz w:val="20"/>
-              </w:rPr>
-              <w:t>Não deveria ser possível reabrir a tela de um pedido que já foi concluído</w:t>
-            </w:r>
-          </w:p>
-        </w:tc>
-      </w:tr>
-      <w:tr>
-        <w:tc>
-          <w:tcPr>
-            <w:tcW w:type="dxa" w:w="2304"/>
-            <w:shd w:val="clear" w:color="auto" w:fill="E7E6E6"/>
-          </w:tcPr>
-          <w:p>
-            <w:r>
-              <w:rPr>
-                <w:rFonts w:ascii="Calibri" w:hAnsi="Calibri"/>
-                <w:b/>
-                <w:i w:val="0"/>
-                <w:sz w:val="20"/>
-              </w:rPr>
-              <w:t>Resultado Obtido</w:t>
-            </w:r>
-          </w:p>
-        </w:tc>
-        <w:tc>
-          <w:tcPr>
-            <w:tcW w:type="dxa" w:w="6912"/>
-          </w:tcPr>
-          <w:p>
-            <w:r>
-              <w:rPr>
-                <w:rFonts w:ascii="Calibri" w:hAnsi="Calibri"/>
-                <w:b w:val="0"/>
-                <w:i w:val="0"/>
-                <w:sz w:val="20"/>
-              </w:rPr>
-              <w:t>A tela "Checkout: Complete!" é reexibida normalmente, como se o pedido pudesse ser "finalizado" de novo</w:t>
-            </w:r>
-          </w:p>
-        </w:tc>
-      </w:tr>
-      <w:tr>
-        <w:tc>
-          <w:tcPr>
-            <w:tcW w:type="dxa" w:w="2304"/>
-            <w:shd w:val="clear" w:color="auto" w:fill="E7E6E6"/>
-          </w:tcPr>
-          <w:p>
-            <w:r>
-              <w:rPr>
-                <w:rFonts w:ascii="Calibri" w:hAnsi="Calibri"/>
-                <w:b/>
-                <w:i w:val="0"/>
-                <w:sz w:val="20"/>
-              </w:rPr>
-              <w:t>Severidade</w:t>
-            </w:r>
-          </w:p>
-        </w:tc>
-        <w:tc>
-          <w:tcPr>
-            <w:tcW w:type="dxa" w:w="6912"/>
-          </w:tcPr>
-          <w:p>
-            <w:r>
-              <w:rPr>
-                <w:rFonts w:ascii="Calibri" w:hAnsi="Calibri"/>
-                <w:b w:val="0"/>
-                <w:i w:val="0"/>
-                <w:sz w:val="20"/>
-              </w:rPr>
-              <w:t>Média</w:t>
-            </w:r>
-          </w:p>
-        </w:tc>
-      </w:tr>
-      <w:tr>
-        <w:tc>
-          <w:tcPr>
-            <w:tcW w:type="dxa" w:w="2304"/>
-            <w:shd w:val="clear" w:color="auto" w:fill="E7E6E6"/>
-          </w:tcPr>
-          <w:p>
-            <w:r>
-              <w:rPr>
-                <w:rFonts w:ascii="Calibri" w:hAnsi="Calibri"/>
-                <w:b/>
-                <w:i w:val="0"/>
-                <w:sz w:val="20"/>
-              </w:rPr>
-              <w:t>Prioridade</w:t>
-            </w:r>
-          </w:p>
-        </w:tc>
-        <w:tc>
-          <w:tcPr>
-            <w:tcW w:type="dxa" w:w="6912"/>
-          </w:tcPr>
-          <w:p>
-            <w:r>
-              <w:rPr>
-                <w:rFonts w:ascii="Calibri" w:hAnsi="Calibri"/>
-                <w:b w:val="0"/>
-                <w:i w:val="0"/>
-                <w:sz w:val="20"/>
-              </w:rPr>
-              <w:t>Baixa</w:t>
-            </w:r>
-          </w:p>
-        </w:tc>
-      </w:tr>
-      <w:tr>
-        <w:tc>
-          <w:tcPr>
-            <w:tcW w:type="dxa" w:w="2304"/>
-            <w:shd w:val="clear" w:color="auto" w:fill="E7E6E6"/>
-          </w:tcPr>
-          <w:p>
-            <w:r>
-              <w:rPr>
-                <w:rFonts w:ascii="Calibri" w:hAnsi="Calibri"/>
-                <w:b/>
-                <w:i w:val="0"/>
-                <w:sz w:val="20"/>
-              </w:rPr>
-              <w:t>Evidência</w:t>
-            </w:r>
-          </w:p>
-        </w:tc>
-        <w:tc>
-          <w:tcPr>
-            <w:tcW w:type="dxa" w:w="6912"/>
-          </w:tcPr>
-          <w:p>
-            <w:r>
-              <w:rPr>
-                <w:rFonts w:ascii="Calibri" w:hAnsi="Calibri"/>
-                <w:b w:val="0"/>
-                <w:i w:val="0"/>
-                <w:sz w:val="20"/>
-              </w:rPr>
-              <w:t>print da tela reaberta logo após clicar em Voltar no navegador</w:t>
-            </w:r>
-          </w:p>
-        </w:tc>
-      </w:tr>
-    </w:tbl>
-    <w:p>
-      <w:pPr>
-        <w:spacing w:after="120"/>
-      </w:pPr>
-    </w:p>
-    <w:p>
-      <w:pPr>
-        <w:spacing w:before="200" w:after="80"/>
-      </w:pPr>
-      <w:r>
-        <w:rPr>
-          <w:rFonts w:ascii="Calibri" w:hAnsi="Calibri"/>
-          <w:b/>
-          <w:i w:val="0"/>
-          <w:sz w:val="23"/>
-        </w:rPr>
-        <w:t>4. Resumo</w:t>
-      </w:r>
-    </w:p>
-    <w:tbl>
-      <w:tblPr>
-        <w:tblW w:type="auto" w:w="0"/>
-        <w:jc w:val="center"/>
-        <w:tblLayout w:type="autofit"/>
         <w:tblLook w:firstColumn="1" w:firstRow="1" w:lastColumn="0" w:lastRow="0" w:noHBand="0" w:noVBand="1" w:val="04A0"/>
         <w:tblBorders>
           <w:top w:val="single" w:sz="4" w:space="0" w:color="BFBFBF"/>
@@ -2131,11 +1082,10 @@
       <w:tr>
         <w:tc>
           <w:tcPr>
-            <w:tcW w:type="dxa" w:w="1152"/>
+            <w:tcW w:type="dxa" w:w="1440"/>
             <w:shd w:val="clear" w:color="auto" w:fill="E7E6E6"/>
           </w:tcPr>
           <w:p>
-            <w:r/>
             <w:r>
               <w:rPr>
                 <w:rFonts w:ascii="Calibri" w:hAnsi="Calibri"/>
@@ -2143,25 +1093,23 @@
                 <w:i w:val="0"/>
                 <w:sz w:val="20"/>
               </w:rPr>
-              <w:t>ID</w:t>
+              <w:t>Usuário</w:t>
             </w:r>
           </w:p>
         </w:tc>
         <w:tc>
           <w:tcPr>
-            <w:tcW w:type="dxa" w:w="5184"/>
-            <w:shd w:val="clear" w:color="auto" w:fill="E7E6E6"/>
+            <w:tcW w:type="dxa" w:w="3024"/>
           </w:tcPr>
           <w:p>
-            <w:r/>
             <w:r>
               <w:rPr>
                 <w:rFonts w:ascii="Calibri" w:hAnsi="Calibri"/>
-                <w:b/>
+                <w:b w:val="0"/>
                 <w:i w:val="0"/>
                 <w:sz w:val="20"/>
               </w:rPr>
-              <w:t>Título</w:t>
+              <w:t>standard_user</w:t>
             </w:r>
           </w:p>
         </w:tc>
@@ -2171,7 +1119,6 @@
             <w:shd w:val="clear" w:color="auto" w:fill="E7E6E6"/>
           </w:tcPr>
           <w:p>
-            <w:r/>
             <w:r>
               <w:rPr>
                 <w:rFonts w:ascii="Calibri" w:hAnsi="Calibri"/>
@@ -2185,11 +1132,61 @@
         </w:tc>
         <w:tc>
           <w:tcPr>
+            <w:tcW w:type="dxa" w:w="2736"/>
+          </w:tcPr>
+          <w:p>
+            <w:r>
+              <w:rPr>
+                <w:rFonts w:ascii="Calibri" w:hAnsi="Calibri"/>
+                <w:b w:val="0"/>
+                <w:i w:val="0"/>
+                <w:sz w:val="20"/>
+              </w:rPr>
+              <w:t>Média</w:t>
+            </w:r>
+          </w:p>
+        </w:tc>
+      </w:tr>
+      <w:tr>
+        <w:tc>
+          <w:tcPr>
             <w:tcW w:type="dxa" w:w="1440"/>
             <w:shd w:val="clear" w:color="auto" w:fill="E7E6E6"/>
           </w:tcPr>
           <w:p>
-            <w:r/>
+            <w:r>
+              <w:rPr>
+                <w:rFonts w:ascii="Calibri" w:hAnsi="Calibri"/>
+                <w:b/>
+                <w:i w:val="0"/>
+                <w:sz w:val="20"/>
+              </w:rPr>
+              <w:t>Ambiente</w:t>
+            </w:r>
+          </w:p>
+        </w:tc>
+        <w:tc>
+          <w:tcPr>
+            <w:tcW w:type="dxa" w:w="3024"/>
+          </w:tcPr>
+          <w:p>
+            <w:r>
+              <w:rPr>
+                <w:rFonts w:ascii="Calibri" w:hAnsi="Calibri"/>
+                <w:b w:val="0"/>
+                <w:i w:val="0"/>
+                <w:sz w:val="20"/>
+              </w:rPr>
+              <w:t>Sauce Demo / Google Chrome / Windows</w:t>
+            </w:r>
+          </w:p>
+        </w:tc>
+        <w:tc>
+          <w:tcPr>
+            <w:tcW w:type="dxa" w:w="1440"/>
+            <w:shd w:val="clear" w:color="auto" w:fill="E7E6E6"/>
+          </w:tcPr>
+          <w:p>
             <w:r>
               <w:rPr>
                 <w:rFonts w:ascii="Calibri" w:hAnsi="Calibri"/>
@@ -2201,14 +1198,11 @@
             </w:r>
           </w:p>
         </w:tc>
-      </w:tr>
-      <w:tr>
         <w:tc>
           <w:tcPr>
-            <w:tcW w:type="dxa" w:w="1152"/>
+            <w:tcW w:type="dxa" w:w="2736"/>
           </w:tcPr>
           <w:p>
-            <w:r/>
             <w:r>
               <w:rPr>
                 <w:rFonts w:ascii="Calibri" w:hAnsi="Calibri"/>
@@ -2216,16 +1210,34 @@
                 <w:i w:val="0"/>
                 <w:sz w:val="20"/>
               </w:rPr>
-              <w:t>BUG-001</w:t>
+              <w:t>Média</w:t>
+            </w:r>
+          </w:p>
+        </w:tc>
+      </w:tr>
+      <w:tr>
+        <w:tc>
+          <w:tcPr>
+            <w:tcW w:type="dxa" w:w="1440"/>
+            <w:shd w:val="clear" w:color="auto" w:fill="E7E6E6"/>
+          </w:tcPr>
+          <w:p>
+            <w:r>
+              <w:rPr>
+                <w:rFonts w:ascii="Calibri" w:hAnsi="Calibri"/>
+                <w:b/>
+                <w:i w:val="0"/>
+                <w:sz w:val="20"/>
+              </w:rPr>
+              <w:t>Técnica</w:t>
             </w:r>
           </w:p>
         </w:tc>
         <w:tc>
           <w:tcPr>
-            <w:tcW w:type="dxa" w:w="5184"/>
+            <w:tcW w:type="dxa" w:w="3024"/>
           </w:tcPr>
           <w:p>
-            <w:r/>
             <w:r>
               <w:rPr>
                 <w:rFonts w:ascii="Calibri" w:hAnsi="Calibri"/>
@@ -2233,16 +1245,32 @@
                 <w:i w:val="0"/>
                 <w:sz w:val="20"/>
               </w:rPr>
-              <w:t>"Imagens dos produtos trocadas" — todos os itens mostram a mesma foto</w:t>
+              <w:t>Teste de limites (dados inválidos)</w:t>
             </w:r>
           </w:p>
         </w:tc>
         <w:tc>
           <w:tcPr>
             <w:tcW w:type="dxa" w:w="1440"/>
+            <w:shd w:val="clear" w:color="auto" w:fill="E7E6E6"/>
           </w:tcPr>
           <w:p>
-            <w:r/>
+            <w:r>
+              <w:rPr>
+                <w:rFonts w:ascii="Calibri" w:hAnsi="Calibri"/>
+                <w:b/>
+                <w:i w:val="0"/>
+                <w:sz w:val="20"/>
+              </w:rPr>
+              <w:t>Status</w:t>
+            </w:r>
+          </w:p>
+        </w:tc>
+        <w:tc>
+          <w:tcPr>
+            <w:tcW w:type="dxa" w:w="2736"/>
+          </w:tcPr>
+          <w:p>
             <w:r>
               <w:rPr>
                 <w:rFonts w:ascii="Calibri" w:hAnsi="Calibri"/>
@@ -2250,16 +1278,360 @@
                 <w:i w:val="0"/>
                 <w:sz w:val="20"/>
               </w:rPr>
-              <w:t>Alta</w:t>
+              <w:t>Novo</w:t>
+            </w:r>
+          </w:p>
+        </w:tc>
+      </w:tr>
+    </w:tbl>
+    <w:p>
+      <w:pPr>
+        <w:spacing w:after="80"/>
+      </w:pPr>
+    </w:p>
+    <w:p>
+      <w:pPr>
+        <w:spacing w:after="120"/>
+      </w:pPr>
+      <w:r>
+        <w:rPr>
+          <w:rFonts w:ascii="Calibri" w:hAnsi="Calibri"/>
+          <w:b/>
+          <w:i w:val="0"/>
+          <w:sz w:val="21"/>
+        </w:rPr>
+        <w:t xml:space="preserve">Descrição: </w:t>
+      </w:r>
+      <w:r>
+        <w:t>Durante o checkout, o campo de CEP aceita letras e permite avançar sem nenhuma validação.</w:t>
+      </w:r>
+    </w:p>
+    <w:p>
+      <w:pPr>
+        <w:spacing w:after="120"/>
+      </w:pPr>
+      <w:r>
+        <w:rPr>
+          <w:rFonts w:ascii="Calibri" w:hAnsi="Calibri"/>
+          <w:b/>
+          <w:i w:val="0"/>
+          <w:sz w:val="21"/>
+        </w:rPr>
+        <w:t xml:space="preserve">Pré-condição: </w:t>
+      </w:r>
+      <w:r>
+        <w:t>Usuário autenticado com standard_user; produto no carrinho; etapa de informações do checkout aberta.</w:t>
+      </w:r>
+    </w:p>
+    <w:p>
+      <w:r>
+        <w:rPr>
+          <w:rFonts w:ascii="Calibri" w:hAnsi="Calibri"/>
+          <w:b/>
+          <w:i w:val="0"/>
+          <w:sz w:val="21"/>
+        </w:rPr>
+        <w:t>Passos para reprodução</w:t>
+      </w:r>
+    </w:p>
+    <w:p>
+      <w:pPr>
+        <w:pStyle w:val="ListNumber"/>
+      </w:pPr>
+      <w:r>
+        <w:rPr>
+          <w:rFonts w:ascii="Calibri" w:hAnsi="Calibri"/>
+          <w:b w:val="0"/>
+          <w:i w:val="0"/>
+          <w:sz w:val="21"/>
+        </w:rPr>
+        <w:t>Adicionar um produto ao carrinho.</w:t>
+      </w:r>
+    </w:p>
+    <w:p>
+      <w:pPr>
+        <w:pStyle w:val="ListNumber"/>
+      </w:pPr>
+      <w:r>
+        <w:rPr>
+          <w:rFonts w:ascii="Calibri" w:hAnsi="Calibri"/>
+          <w:b w:val="0"/>
+          <w:i w:val="0"/>
+          <w:sz w:val="21"/>
+        </w:rPr>
+        <w:t>Abrir o carrinho e clicar em Checkout.</w:t>
+      </w:r>
+    </w:p>
+    <w:p>
+      <w:pPr>
+        <w:pStyle w:val="ListNumber"/>
+      </w:pPr>
+      <w:r>
+        <w:rPr>
+          <w:rFonts w:ascii="Calibri" w:hAnsi="Calibri"/>
+          <w:b w:val="0"/>
+          <w:i w:val="0"/>
+          <w:sz w:val="21"/>
+        </w:rPr>
+        <w:t>Preencher nome e sobrenome e digitar caracteres alfabéticos no campo de CEP, como ARARA.</w:t>
+      </w:r>
+    </w:p>
+    <w:p>
+      <w:pPr>
+        <w:pStyle w:val="ListNumber"/>
+      </w:pPr>
+      <w:r>
+        <w:rPr>
+          <w:rFonts w:ascii="Calibri" w:hAnsi="Calibri"/>
+          <w:b w:val="0"/>
+          <w:i w:val="0"/>
+          <w:sz w:val="21"/>
+        </w:rPr>
+        <w:t>Clicar em Continue.</w:t>
+      </w:r>
+    </w:p>
+    <w:p>
+      <w:pPr>
+        <w:spacing w:after="120"/>
+      </w:pPr>
+      <w:r>
+        <w:rPr>
+          <w:rFonts w:ascii="Calibri" w:hAnsi="Calibri"/>
+          <w:b/>
+          <w:i w:val="0"/>
+          <w:sz w:val="21"/>
+        </w:rPr>
+        <w:t xml:space="preserve">Resultado esperado: </w:t>
+      </w:r>
+      <w:r>
+        <w:t>O sistema deveria rejeitar letras no CEP e informar que o valor é inválido.</w:t>
+      </w:r>
+    </w:p>
+    <w:p>
+      <w:pPr>
+        <w:spacing w:after="120"/>
+      </w:pPr>
+      <w:r>
+        <w:rPr>
+          <w:rFonts w:ascii="Calibri" w:hAnsi="Calibri"/>
+          <w:b/>
+          <w:i w:val="0"/>
+          <w:sz w:val="21"/>
+        </w:rPr>
+        <w:t xml:space="preserve">Resultado obtido: </w:t>
+      </w:r>
+      <w:r>
+        <w:t>O campo aceitou as letras e o fluxo seguiu para a tela Checkout: Overview, sem nenhuma mensagem de validação.</w:t>
+      </w:r>
+    </w:p>
+    <w:p>
+      <w:r>
+        <w:rPr>
+          <w:rFonts w:ascii="Calibri" w:hAnsi="Calibri"/>
+          <w:b/>
+          <w:i w:val="0"/>
+          <w:sz w:val="21"/>
+        </w:rPr>
+        <w:t>Evidências</w:t>
+      </w:r>
+    </w:p>
+    <w:p>
+      <w:pPr>
+        <w:jc w:val="center"/>
+      </w:pPr>
+      <w:r>
+        <w:drawing>
+          <wp:inline xmlns:a="http://schemas.openxmlformats.org/drawingml/2006/main" xmlns:pic="http://schemas.openxmlformats.org/drawingml/2006/picture">
+            <wp:extent cx="3931920" cy="3561942"/>
+            <wp:docPr id="3" name="Picture 3"/>
+            <wp:cNvGraphicFramePr>
+              <a:graphicFrameLocks noChangeAspect="1"/>
+            </wp:cNvGraphicFramePr>
+            <a:graphic>
+              <a:graphicData uri="http://schemas.openxmlformats.org/drawingml/2006/picture">
+                <pic:pic>
+                  <pic:nvPicPr>
+                    <pic:cNvPr id="0" name="p2_0.png"/>
+                    <pic:cNvPicPr/>
+                  </pic:nvPicPr>
+                  <pic:blipFill>
+                    <a:blip r:embed="rId11"/>
+                    <a:stretch>
+                      <a:fillRect/>
+                    </a:stretch>
+                  </pic:blipFill>
+                  <pic:spPr>
+                    <a:xfrm>
+                      <a:off x="0" y="0"/>
+                      <a:ext cx="3931920" cy="3561942"/>
+                    </a:xfrm>
+                    <a:prstGeom prst="rect"/>
+                  </pic:spPr>
+                </pic:pic>
+              </a:graphicData>
+            </a:graphic>
+          </wp:inline>
+        </w:drawing>
+      </w:r>
+    </w:p>
+    <w:p>
+      <w:pPr>
+        <w:jc w:val="center"/>
+      </w:pPr>
+      <w:r>
+        <w:rPr>
+          <w:rFonts w:ascii="Calibri" w:hAnsi="Calibri"/>
+          <w:b w:val="0"/>
+          <w:i/>
+          <w:color w:val="595959"/>
+          <w:sz w:val="18"/>
+        </w:rPr>
+        <w:t>Figura 1 – Formulário de checkout com o CEP preenchido como "ARARA".</w:t>
+      </w:r>
+    </w:p>
+    <w:p>
+      <w:pPr>
+        <w:jc w:val="center"/>
+      </w:pPr>
+      <w:r>
+        <w:drawing>
+          <wp:inline xmlns:a="http://schemas.openxmlformats.org/drawingml/2006/main" xmlns:pic="http://schemas.openxmlformats.org/drawingml/2006/picture">
+            <wp:extent cx="3931920" cy="2211705"/>
+            <wp:docPr id="4" name="Picture 4"/>
+            <wp:cNvGraphicFramePr>
+              <a:graphicFrameLocks noChangeAspect="1"/>
+            </wp:cNvGraphicFramePr>
+            <a:graphic>
+              <a:graphicData uri="http://schemas.openxmlformats.org/drawingml/2006/picture">
+                <pic:pic>
+                  <pic:nvPicPr>
+                    <pic:cNvPr id="0" name="p2_1.png"/>
+                    <pic:cNvPicPr/>
+                  </pic:nvPicPr>
+                  <pic:blipFill>
+                    <a:blip r:embed="rId12"/>
+                    <a:stretch>
+                      <a:fillRect/>
+                    </a:stretch>
+                  </pic:blipFill>
+                  <pic:spPr>
+                    <a:xfrm>
+                      <a:off x="0" y="0"/>
+                      <a:ext cx="3931920" cy="2211705"/>
+                    </a:xfrm>
+                    <a:prstGeom prst="rect"/>
+                  </pic:spPr>
+                </pic:pic>
+              </a:graphicData>
+            </a:graphic>
+          </wp:inline>
+        </w:drawing>
+      </w:r>
+    </w:p>
+    <w:p>
+      <w:pPr>
+        <w:jc w:val="center"/>
+      </w:pPr>
+      <w:r>
+        <w:rPr>
+          <w:rFonts w:ascii="Calibri" w:hAnsi="Calibri"/>
+          <w:b w:val="0"/>
+          <w:i/>
+          <w:color w:val="595959"/>
+          <w:sz w:val="18"/>
+        </w:rPr>
+        <w:t>Figura 2 – Tela seguinte (checkout-step-two.html): o checkout avançou normalmente com o CEP inválido.</w:t>
+      </w:r>
+    </w:p>
+    <w:p>
+      <w:pPr>
+        <w:spacing w:before="200" w:after="80"/>
+      </w:pPr>
+      <w:r>
+        <w:rPr>
+          <w:rFonts w:ascii="Calibri" w:hAnsi="Calibri"/>
+          <w:b/>
+          <w:i w:val="0"/>
+          <w:sz w:val="23"/>
+        </w:rPr>
+        <w:t>BUG-002 — Checkout pode ser concluído com carrinho vazio</w:t>
+      </w:r>
+    </w:p>
+    <w:tbl>
+      <w:tblPr>
+        <w:tblW w:type="auto" w:w="0"/>
+        <w:tblLook w:firstColumn="1" w:firstRow="1" w:lastColumn="0" w:lastRow="0" w:noHBand="0" w:noVBand="1" w:val="04A0"/>
+        <w:tblBorders>
+          <w:top w:val="single" w:sz="4" w:space="0" w:color="BFBFBF"/>
+          <w:left w:val="single" w:sz="4" w:space="0" w:color="BFBFBF"/>
+          <w:bottom w:val="single" w:sz="4" w:space="0" w:color="BFBFBF"/>
+          <w:right w:val="single" w:sz="4" w:space="0" w:color="BFBFBF"/>
+          <w:insideH w:val="single" w:sz="4" w:space="0" w:color="BFBFBF"/>
+          <w:insideV w:val="single" w:sz="4" w:space="0" w:color="BFBFBF"/>
+        </w:tblBorders>
+      </w:tblPr>
+      <w:tblGrid>
+        <w:gridCol w:w="2493"/>
+        <w:gridCol w:w="2493"/>
+        <w:gridCol w:w="2493"/>
+        <w:gridCol w:w="2493"/>
+      </w:tblGrid>
+      <w:tr>
+        <w:tc>
+          <w:tcPr>
+            <w:tcW w:type="dxa" w:w="1440"/>
+            <w:shd w:val="clear" w:color="auto" w:fill="E7E6E6"/>
+          </w:tcPr>
+          <w:p>
+            <w:r>
+              <w:rPr>
+                <w:rFonts w:ascii="Calibri" w:hAnsi="Calibri"/>
+                <w:b/>
+                <w:i w:val="0"/>
+                <w:sz w:val="20"/>
+              </w:rPr>
+              <w:t>Usuário</w:t>
+            </w:r>
+          </w:p>
+        </w:tc>
+        <w:tc>
+          <w:tcPr>
+            <w:tcW w:type="dxa" w:w="3024"/>
+          </w:tcPr>
+          <w:p>
+            <w:r>
+              <w:rPr>
+                <w:rFonts w:ascii="Calibri" w:hAnsi="Calibri"/>
+                <w:b w:val="0"/>
+                <w:i w:val="0"/>
+                <w:sz w:val="20"/>
+              </w:rPr>
+              <w:t>standard_user</w:t>
             </w:r>
           </w:p>
         </w:tc>
         <w:tc>
           <w:tcPr>
             <w:tcW w:type="dxa" w:w="1440"/>
+            <w:shd w:val="clear" w:color="auto" w:fill="E7E6E6"/>
           </w:tcPr>
           <w:p>
-            <w:r/>
+            <w:r>
+              <w:rPr>
+                <w:rFonts w:ascii="Calibri" w:hAnsi="Calibri"/>
+                <w:b/>
+                <w:i w:val="0"/>
+                <w:sz w:val="20"/>
+              </w:rPr>
+              <w:t>Severidade</w:t>
+            </w:r>
+          </w:p>
+        </w:tc>
+        <w:tc>
+          <w:tcPr>
+            <w:tcW w:type="dxa" w:w="2736"/>
+          </w:tcPr>
+          <w:p>
             <w:r>
               <w:rPr>
                 <w:rFonts w:ascii="Calibri" w:hAnsi="Calibri"/>
@@ -2275,10 +1647,26 @@
       <w:tr>
         <w:tc>
           <w:tcPr>
-            <w:tcW w:type="dxa" w:w="1152"/>
+            <w:tcW w:type="dxa" w:w="1440"/>
+            <w:shd w:val="clear" w:color="auto" w:fill="E7E6E6"/>
           </w:tcPr>
           <w:p>
-            <w:r/>
+            <w:r>
+              <w:rPr>
+                <w:rFonts w:ascii="Calibri" w:hAnsi="Calibri"/>
+                <w:b/>
+                <w:i w:val="0"/>
+                <w:sz w:val="20"/>
+              </w:rPr>
+              <w:t>Ambiente</w:t>
+            </w:r>
+          </w:p>
+        </w:tc>
+        <w:tc>
+          <w:tcPr>
+            <w:tcW w:type="dxa" w:w="3024"/>
+          </w:tcPr>
+          <w:p>
             <w:r>
               <w:rPr>
                 <w:rFonts w:ascii="Calibri" w:hAnsi="Calibri"/>
@@ -2286,120 +1674,32 @@
                 <w:i w:val="0"/>
                 <w:sz w:val="20"/>
               </w:rPr>
-              <w:t>BUG-002</w:t>
-            </w:r>
-          </w:p>
-        </w:tc>
-        <w:tc>
-          <w:tcPr>
-            <w:tcW w:type="dxa" w:w="5184"/>
-          </w:tcPr>
-          <w:p>
-            <w:r/>
-            <w:r>
-              <w:rPr>
-                <w:rFonts w:ascii="Calibri" w:hAnsi="Calibri"/>
-                <w:b w:val="0"/>
-                <w:i w:val="0"/>
-                <w:sz w:val="20"/>
-              </w:rPr>
-              <w:t>Ordenação "Name (Z to A)" não reordena a lista de produtos</w:t>
+              <w:t>Sauce Demo / Google Chrome / Windows</w:t>
             </w:r>
           </w:p>
         </w:tc>
         <w:tc>
           <w:tcPr>
             <w:tcW w:type="dxa" w:w="1440"/>
+            <w:shd w:val="clear" w:color="auto" w:fill="E7E6E6"/>
           </w:tcPr>
           <w:p>
-            <w:r/>
             <w:r>
               <w:rPr>
                 <w:rFonts w:ascii="Calibri" w:hAnsi="Calibri"/>
-                <w:b w:val="0"/>
+                <w:b/>
                 <w:i w:val="0"/>
                 <w:sz w:val="20"/>
               </w:rPr>
-              <w:t>Baixa</w:t>
+              <w:t>Prioridade</w:t>
             </w:r>
           </w:p>
         </w:tc>
         <w:tc>
           <w:tcPr>
-            <w:tcW w:type="dxa" w:w="1440"/>
+            <w:tcW w:type="dxa" w:w="2736"/>
           </w:tcPr>
           <w:p>
-            <w:r/>
-            <w:r>
-              <w:rPr>
-                <w:rFonts w:ascii="Calibri" w:hAnsi="Calibri"/>
-                <w:b w:val="0"/>
-                <w:i w:val="0"/>
-                <w:sz w:val="20"/>
-              </w:rPr>
-              <w:t>Baixa</w:t>
-            </w:r>
-          </w:p>
-        </w:tc>
-      </w:tr>
-      <w:tr>
-        <w:tc>
-          <w:tcPr>
-            <w:tcW w:type="dxa" w:w="1152"/>
-          </w:tcPr>
-          <w:p>
-            <w:r/>
-            <w:r>
-              <w:rPr>
-                <w:rFonts w:ascii="Calibri" w:hAnsi="Calibri"/>
-                <w:b w:val="0"/>
-                <w:i w:val="0"/>
-                <w:sz w:val="20"/>
-              </w:rPr>
-              <w:t>BUG-003</w:t>
-            </w:r>
-          </w:p>
-        </w:tc>
-        <w:tc>
-          <w:tcPr>
-            <w:tcW w:type="dxa" w:w="5184"/>
-          </w:tcPr>
-          <w:p>
-            <w:r/>
-            <w:r>
-              <w:rPr>
-                <w:rFonts w:ascii="Calibri" w:hAnsi="Calibri"/>
-                <w:b w:val="0"/>
-                <w:i w:val="0"/>
-                <w:sz w:val="20"/>
-              </w:rPr>
-              <w:t>Campo "Last Name" não aceita digitação na tela de Checkout</w:t>
-            </w:r>
-          </w:p>
-        </w:tc>
-        <w:tc>
-          <w:tcPr>
-            <w:tcW w:type="dxa" w:w="1440"/>
-          </w:tcPr>
-          <w:p>
-            <w:r/>
-            <w:r>
-              <w:rPr>
-                <w:rFonts w:ascii="Calibri" w:hAnsi="Calibri"/>
-                <w:b w:val="0"/>
-                <w:i w:val="0"/>
-                <w:sz w:val="20"/>
-              </w:rPr>
-              <w:t>Crítica</w:t>
-            </w:r>
-          </w:p>
-        </w:tc>
-        <w:tc>
-          <w:tcPr>
-            <w:tcW w:type="dxa" w:w="1440"/>
-          </w:tcPr>
-          <w:p>
-            <w:r/>
             <w:r>
               <w:rPr>
                 <w:rFonts w:ascii="Calibri" w:hAnsi="Calibri"/>
@@ -2415,10 +1715,26 @@
       <w:tr>
         <w:tc>
           <w:tcPr>
-            <w:tcW w:type="dxa" w:w="1152"/>
+            <w:tcW w:type="dxa" w:w="1440"/>
+            <w:shd w:val="clear" w:color="auto" w:fill="E7E6E6"/>
           </w:tcPr>
           <w:p>
-            <w:r/>
+            <w:r>
+              <w:rPr>
+                <w:rFonts w:ascii="Calibri" w:hAnsi="Calibri"/>
+                <w:b/>
+                <w:i w:val="0"/>
+                <w:sz w:val="20"/>
+              </w:rPr>
+              <w:t>Técnica</w:t>
+            </w:r>
+          </w:p>
+        </w:tc>
+        <w:tc>
+          <w:tcPr>
+            <w:tcW w:type="dxa" w:w="3024"/>
+          </w:tcPr>
+          <w:p>
             <w:r>
               <w:rPr>
                 <w:rFonts w:ascii="Calibri" w:hAnsi="Calibri"/>
@@ -2426,16 +1742,32 @@
                 <w:i w:val="0"/>
                 <w:sz w:val="20"/>
               </w:rPr>
-              <w:t>BUG-004</w:t>
+              <w:t>Teste de fluxos alternativos</w:t>
             </w:r>
           </w:p>
         </w:tc>
         <w:tc>
           <w:tcPr>
-            <w:tcW w:type="dxa" w:w="5184"/>
+            <w:tcW w:type="dxa" w:w="1440"/>
+            <w:shd w:val="clear" w:color="auto" w:fill="E7E6E6"/>
           </w:tcPr>
           <w:p>
-            <w:r/>
+            <w:r>
+              <w:rPr>
+                <w:rFonts w:ascii="Calibri" w:hAnsi="Calibri"/>
+                <w:b/>
+                <w:i w:val="0"/>
+                <w:sz w:val="20"/>
+              </w:rPr>
+              <w:t>Status</w:t>
+            </w:r>
+          </w:p>
+        </w:tc>
+        <w:tc>
+          <w:tcPr>
+            <w:tcW w:type="dxa" w:w="2736"/>
+          </w:tcPr>
+          <w:p>
             <w:r>
               <w:rPr>
                 <w:rFonts w:ascii="Calibri" w:hAnsi="Calibri"/>
@@ -2443,16 +1775,381 @@
                 <w:i w:val="0"/>
                 <w:sz w:val="20"/>
               </w:rPr>
-              <w:t>Layout quebrado na tela de produtos</w:t>
+              <w:t>Novo</w:t>
+            </w:r>
+          </w:p>
+        </w:tc>
+      </w:tr>
+    </w:tbl>
+    <w:p>
+      <w:pPr>
+        <w:spacing w:after="80"/>
+      </w:pPr>
+    </w:p>
+    <w:p>
+      <w:pPr>
+        <w:spacing w:after="120"/>
+      </w:pPr>
+      <w:r>
+        <w:rPr>
+          <w:rFonts w:ascii="Calibri" w:hAnsi="Calibri"/>
+          <w:b/>
+          <w:i w:val="0"/>
+          <w:sz w:val="21"/>
+        </w:rPr>
+        <w:t xml:space="preserve">Descrição: </w:t>
+      </w:r>
+      <w:r>
+        <w:t>O sistema permite iniciar e concluir o checkout mesmo sem nenhum produto no carrinho.</w:t>
+      </w:r>
+    </w:p>
+    <w:p>
+      <w:pPr>
+        <w:spacing w:after="120"/>
+      </w:pPr>
+      <w:r>
+        <w:rPr>
+          <w:rFonts w:ascii="Calibri" w:hAnsi="Calibri"/>
+          <w:b/>
+          <w:i w:val="0"/>
+          <w:sz w:val="21"/>
+        </w:rPr>
+        <w:t xml:space="preserve">Pré-condição: </w:t>
+      </w:r>
+      <w:r>
+        <w:t>Usuário autenticado com standard_user; carrinho sem itens.</w:t>
+      </w:r>
+    </w:p>
+    <w:p>
+      <w:r>
+        <w:rPr>
+          <w:rFonts w:ascii="Calibri" w:hAnsi="Calibri"/>
+          <w:b/>
+          <w:i w:val="0"/>
+          <w:sz w:val="21"/>
+        </w:rPr>
+        <w:t>Passos para reprodução</w:t>
+      </w:r>
+    </w:p>
+    <w:p>
+      <w:pPr>
+        <w:pStyle w:val="ListNumber"/>
+      </w:pPr>
+      <w:r>
+        <w:rPr>
+          <w:rFonts w:ascii="Calibri" w:hAnsi="Calibri"/>
+          <w:b w:val="0"/>
+          <w:i w:val="0"/>
+          <w:sz w:val="21"/>
+        </w:rPr>
+        <w:t>Abrir o carrinho sem adicionar nenhum produto.</w:t>
+      </w:r>
+    </w:p>
+    <w:p>
+      <w:pPr>
+        <w:pStyle w:val="ListNumber"/>
+      </w:pPr>
+      <w:r>
+        <w:rPr>
+          <w:rFonts w:ascii="Calibri" w:hAnsi="Calibri"/>
+          <w:b w:val="0"/>
+          <w:i w:val="0"/>
+          <w:sz w:val="21"/>
+        </w:rPr>
+        <w:t>Clicar em Checkout.</w:t>
+      </w:r>
+    </w:p>
+    <w:p>
+      <w:pPr>
+        <w:pStyle w:val="ListNumber"/>
+      </w:pPr>
+      <w:r>
+        <w:rPr>
+          <w:rFonts w:ascii="Calibri" w:hAnsi="Calibri"/>
+          <w:b w:val="0"/>
+          <w:i w:val="0"/>
+          <w:sz w:val="21"/>
+        </w:rPr>
+        <w:t>Preencher nome, sobrenome e CEP e clicar em Continue.</w:t>
+      </w:r>
+    </w:p>
+    <w:p>
+      <w:pPr>
+        <w:pStyle w:val="ListNumber"/>
+      </w:pPr>
+      <w:r>
+        <w:rPr>
+          <w:rFonts w:ascii="Calibri" w:hAnsi="Calibri"/>
+          <w:b w:val="0"/>
+          <w:i w:val="0"/>
+          <w:sz w:val="21"/>
+        </w:rPr>
+        <w:t>Na tela de resumo (Total $0.00), clicar em Finish.</w:t>
+      </w:r>
+    </w:p>
+    <w:p>
+      <w:pPr>
+        <w:spacing w:after="120"/>
+      </w:pPr>
+      <w:r>
+        <w:rPr>
+          <w:rFonts w:ascii="Calibri" w:hAnsi="Calibri"/>
+          <w:b/>
+          <w:i w:val="0"/>
+          <w:sz w:val="21"/>
+        </w:rPr>
+        <w:t xml:space="preserve">Resultado esperado: </w:t>
+      </w:r>
+      <w:r>
+        <w:t>O sistema deveria impedir o início ou a finalização do checkout com o carrinho vazio e informar que é preciso adicionar um produto.</w:t>
+      </w:r>
+    </w:p>
+    <w:p>
+      <w:pPr>
+        <w:spacing w:after="120"/>
+      </w:pPr>
+      <w:r>
+        <w:rPr>
+          <w:rFonts w:ascii="Calibri" w:hAnsi="Calibri"/>
+          <w:b/>
+          <w:i w:val="0"/>
+          <w:sz w:val="21"/>
+        </w:rPr>
+        <w:t xml:space="preserve">Resultado obtido: </w:t>
+      </w:r>
+      <w:r>
+        <w:t>O sistema permitiu avançar com Item total: $0, Tax: $0.00 e Total: $0.00 e exibiu a tela Checkout: Complete! ("Thank you for your order!"), ou seja, um pedido de valor zero foi concluído.</w:t>
+      </w:r>
+    </w:p>
+    <w:p>
+      <w:r>
+        <w:rPr>
+          <w:rFonts w:ascii="Calibri" w:hAnsi="Calibri"/>
+          <w:b/>
+          <w:i w:val="0"/>
+          <w:sz w:val="21"/>
+        </w:rPr>
+        <w:t>Evidências</w:t>
+      </w:r>
+    </w:p>
+    <w:p>
+      <w:pPr>
+        <w:jc w:val="center"/>
+      </w:pPr>
+      <w:r>
+        <w:drawing>
+          <wp:inline xmlns:a="http://schemas.openxmlformats.org/drawingml/2006/main" xmlns:pic="http://schemas.openxmlformats.org/drawingml/2006/picture">
+            <wp:extent cx="3931920" cy="2211705"/>
+            <wp:docPr id="5" name="Picture 5"/>
+            <wp:cNvGraphicFramePr>
+              <a:graphicFrameLocks noChangeAspect="1"/>
+            </wp:cNvGraphicFramePr>
+            <a:graphic>
+              <a:graphicData uri="http://schemas.openxmlformats.org/drawingml/2006/picture">
+                <pic:pic>
+                  <pic:nvPicPr>
+                    <pic:cNvPr id="0" name="p3_0.png"/>
+                    <pic:cNvPicPr/>
+                  </pic:nvPicPr>
+                  <pic:blipFill>
+                    <a:blip r:embed="rId13"/>
+                    <a:stretch>
+                      <a:fillRect/>
+                    </a:stretch>
+                  </pic:blipFill>
+                  <pic:spPr>
+                    <a:xfrm>
+                      <a:off x="0" y="0"/>
+                      <a:ext cx="3931920" cy="2211705"/>
+                    </a:xfrm>
+                    <a:prstGeom prst="rect"/>
+                  </pic:spPr>
+                </pic:pic>
+              </a:graphicData>
+            </a:graphic>
+          </wp:inline>
+        </w:drawing>
+      </w:r>
+    </w:p>
+    <w:p>
+      <w:pPr>
+        <w:jc w:val="center"/>
+      </w:pPr>
+      <w:r>
+        <w:rPr>
+          <w:rFonts w:ascii="Calibri" w:hAnsi="Calibri"/>
+          <w:b w:val="0"/>
+          <w:i/>
+          <w:color w:val="595959"/>
+          <w:sz w:val="18"/>
+        </w:rPr>
+        <w:t>Figura 3 – Carrinho vazio com o botão Checkout habilitado.</w:t>
+      </w:r>
+    </w:p>
+    <w:p>
+      <w:pPr>
+        <w:jc w:val="center"/>
+      </w:pPr>
+      <w:r>
+        <w:drawing>
+          <wp:inline xmlns:a="http://schemas.openxmlformats.org/drawingml/2006/main" xmlns:pic="http://schemas.openxmlformats.org/drawingml/2006/picture">
+            <wp:extent cx="3931920" cy="2211705"/>
+            <wp:docPr id="6" name="Picture 6"/>
+            <wp:cNvGraphicFramePr>
+              <a:graphicFrameLocks noChangeAspect="1"/>
+            </wp:cNvGraphicFramePr>
+            <a:graphic>
+              <a:graphicData uri="http://schemas.openxmlformats.org/drawingml/2006/picture">
+                <pic:pic>
+                  <pic:nvPicPr>
+                    <pic:cNvPr id="0" name="p4_0.png"/>
+                    <pic:cNvPicPr/>
+                  </pic:nvPicPr>
+                  <pic:blipFill>
+                    <a:blip r:embed="rId14"/>
+                    <a:stretch>
+                      <a:fillRect/>
+                    </a:stretch>
+                  </pic:blipFill>
+                  <pic:spPr>
+                    <a:xfrm>
+                      <a:off x="0" y="0"/>
+                      <a:ext cx="3931920" cy="2211705"/>
+                    </a:xfrm>
+                    <a:prstGeom prst="rect"/>
+                  </pic:spPr>
+                </pic:pic>
+              </a:graphicData>
+            </a:graphic>
+          </wp:inline>
+        </w:drawing>
+      </w:r>
+    </w:p>
+    <w:p>
+      <w:pPr>
+        <w:jc w:val="center"/>
+      </w:pPr>
+      <w:r>
+        <w:rPr>
+          <w:rFonts w:ascii="Calibri" w:hAnsi="Calibri"/>
+          <w:b w:val="0"/>
+          <w:i/>
+          <w:color w:val="595959"/>
+          <w:sz w:val="18"/>
+        </w:rPr>
+        <w:t>Figura 4 – Resumo do pedido sem itens: Total $0.00.</w:t>
+      </w:r>
+    </w:p>
+    <w:p>
+      <w:pPr>
+        <w:jc w:val="center"/>
+      </w:pPr>
+      <w:r>
+        <w:drawing>
+          <wp:inline xmlns:a="http://schemas.openxmlformats.org/drawingml/2006/main" xmlns:pic="http://schemas.openxmlformats.org/drawingml/2006/picture">
+            <wp:extent cx="3931920" cy="2211705"/>
+            <wp:docPr id="7" name="Picture 7"/>
+            <wp:cNvGraphicFramePr>
+              <a:graphicFrameLocks noChangeAspect="1"/>
+            </wp:cNvGraphicFramePr>
+            <a:graphic>
+              <a:graphicData uri="http://schemas.openxmlformats.org/drawingml/2006/picture">
+                <pic:pic>
+                  <pic:nvPicPr>
+                    <pic:cNvPr id="0" name="p4_1.png"/>
+                    <pic:cNvPicPr/>
+                  </pic:nvPicPr>
+                  <pic:blipFill>
+                    <a:blip r:embed="rId15"/>
+                    <a:stretch>
+                      <a:fillRect/>
+                    </a:stretch>
+                  </pic:blipFill>
+                  <pic:spPr>
+                    <a:xfrm>
+                      <a:off x="0" y="0"/>
+                      <a:ext cx="3931920" cy="2211705"/>
+                    </a:xfrm>
+                    <a:prstGeom prst="rect"/>
+                  </pic:spPr>
+                </pic:pic>
+              </a:graphicData>
+            </a:graphic>
+          </wp:inline>
+        </w:drawing>
+      </w:r>
+    </w:p>
+    <w:p>
+      <w:pPr>
+        <w:jc w:val="center"/>
+      </w:pPr>
+      <w:r>
+        <w:rPr>
+          <w:rFonts w:ascii="Calibri" w:hAnsi="Calibri"/>
+          <w:b w:val="0"/>
+          <w:i/>
+          <w:color w:val="595959"/>
+          <w:sz w:val="18"/>
+        </w:rPr>
+        <w:t>Figura 5 – Tela "Checkout: Complete!" exibida para o pedido vazio.</w:t>
+      </w:r>
+    </w:p>
+    <w:p>
+      <w:pPr>
+        <w:spacing w:before="200" w:after="80"/>
+      </w:pPr>
+      <w:r>
+        <w:rPr>
+          <w:rFonts w:ascii="Calibri" w:hAnsi="Calibri"/>
+          <w:b/>
+          <w:i w:val="0"/>
+          <w:sz w:val="23"/>
+        </w:rPr>
+        <w:t>BUG-003 — Todos os produtos exibem a mesma imagem (cachorro)</w:t>
+      </w:r>
+    </w:p>
+    <w:tbl>
+      <w:tblPr>
+        <w:tblW w:type="auto" w:w="0"/>
+        <w:tblLook w:firstColumn="1" w:firstRow="1" w:lastColumn="0" w:lastRow="0" w:noHBand="0" w:noVBand="1" w:val="04A0"/>
+        <w:tblBorders>
+          <w:top w:val="single" w:sz="4" w:space="0" w:color="BFBFBF"/>
+          <w:left w:val="single" w:sz="4" w:space="0" w:color="BFBFBF"/>
+          <w:bottom w:val="single" w:sz="4" w:space="0" w:color="BFBFBF"/>
+          <w:right w:val="single" w:sz="4" w:space="0" w:color="BFBFBF"/>
+          <w:insideH w:val="single" w:sz="4" w:space="0" w:color="BFBFBF"/>
+          <w:insideV w:val="single" w:sz="4" w:space="0" w:color="BFBFBF"/>
+        </w:tblBorders>
+      </w:tblPr>
+      <w:tblGrid>
+        <w:gridCol w:w="2493"/>
+        <w:gridCol w:w="2493"/>
+        <w:gridCol w:w="2493"/>
+        <w:gridCol w:w="2493"/>
+      </w:tblGrid>
+      <w:tr>
+        <w:tc>
+          <w:tcPr>
+            <w:tcW w:type="dxa" w:w="1440"/>
+            <w:shd w:val="clear" w:color="auto" w:fill="E7E6E6"/>
+          </w:tcPr>
+          <w:p>
+            <w:r>
+              <w:rPr>
+                <w:rFonts w:ascii="Calibri" w:hAnsi="Calibri"/>
+                <w:b/>
+                <w:i w:val="0"/>
+                <w:sz w:val="20"/>
+              </w:rPr>
+              <w:t>Usuário</w:t>
             </w:r>
           </w:p>
         </w:tc>
         <w:tc>
           <w:tcPr>
-            <w:tcW w:type="dxa" w:w="1440"/>
+            <w:tcW w:type="dxa" w:w="3024"/>
           </w:tcPr>
           <w:p>
-            <w:r/>
             <w:r>
               <w:rPr>
                 <w:rFonts w:ascii="Calibri" w:hAnsi="Calibri"/>
@@ -2460,16 +2157,32 @@
                 <w:i w:val="0"/>
                 <w:sz w:val="20"/>
               </w:rPr>
-              <w:t>Média</w:t>
+              <w:t>problem_user</w:t>
             </w:r>
           </w:p>
         </w:tc>
         <w:tc>
           <w:tcPr>
             <w:tcW w:type="dxa" w:w="1440"/>
+            <w:shd w:val="clear" w:color="auto" w:fill="E7E6E6"/>
           </w:tcPr>
           <w:p>
-            <w:r/>
+            <w:r>
+              <w:rPr>
+                <w:rFonts w:ascii="Calibri" w:hAnsi="Calibri"/>
+                <w:b/>
+                <w:i w:val="0"/>
+                <w:sz w:val="20"/>
+              </w:rPr>
+              <w:t>Severidade</w:t>
+            </w:r>
+          </w:p>
+        </w:tc>
+        <w:tc>
+          <w:tcPr>
+            <w:tcW w:type="dxa" w:w="2736"/>
+          </w:tcPr>
+          <w:p>
             <w:r>
               <w:rPr>
                 <w:rFonts w:ascii="Calibri" w:hAnsi="Calibri"/>
@@ -2485,10 +2198,26 @@
       <w:tr>
         <w:tc>
           <w:tcPr>
-            <w:tcW w:type="dxa" w:w="1152"/>
+            <w:tcW w:type="dxa" w:w="1440"/>
+            <w:shd w:val="clear" w:color="auto" w:fill="E7E6E6"/>
           </w:tcPr>
           <w:p>
-            <w:r/>
+            <w:r>
+              <w:rPr>
+                <w:rFonts w:ascii="Calibri" w:hAnsi="Calibri"/>
+                <w:b/>
+                <w:i w:val="0"/>
+                <w:sz w:val="20"/>
+              </w:rPr>
+              <w:t>Ambiente</w:t>
+            </w:r>
+          </w:p>
+        </w:tc>
+        <w:tc>
+          <w:tcPr>
+            <w:tcW w:type="dxa" w:w="3024"/>
+          </w:tcPr>
+          <w:p>
             <w:r>
               <w:rPr>
                 <w:rFonts w:ascii="Calibri" w:hAnsi="Calibri"/>
@@ -2496,33 +2225,32 @@
                 <w:i w:val="0"/>
                 <w:sz w:val="20"/>
               </w:rPr>
-              <w:t>BUG-005</w:t>
-            </w:r>
-          </w:p>
-        </w:tc>
-        <w:tc>
-          <w:tcPr>
-            <w:tcW w:type="dxa" w:w="5184"/>
-          </w:tcPr>
-          <w:p>
-            <w:r/>
-            <w:r>
-              <w:rPr>
-                <w:rFonts w:ascii="Calibri" w:hAnsi="Calibri"/>
-                <w:b w:val="0"/>
-                <w:i w:val="0"/>
-                <w:sz w:val="20"/>
-              </w:rPr>
-              <w:t>Botão "Voltar" do navegador reexibe a tela de pedido já finalizado</w:t>
+              <w:t>Sauce Demo / Google Chrome / Windows</w:t>
             </w:r>
           </w:p>
         </w:tc>
         <w:tc>
           <w:tcPr>
             <w:tcW w:type="dxa" w:w="1440"/>
+            <w:shd w:val="clear" w:color="auto" w:fill="E7E6E6"/>
           </w:tcPr>
           <w:p>
-            <w:r/>
+            <w:r>
+              <w:rPr>
+                <w:rFonts w:ascii="Calibri" w:hAnsi="Calibri"/>
+                <w:b/>
+                <w:i w:val="0"/>
+                <w:sz w:val="20"/>
+              </w:rPr>
+              <w:t>Prioridade</w:t>
+            </w:r>
+          </w:p>
+        </w:tc>
+        <w:tc>
+          <w:tcPr>
+            <w:tcW w:type="dxa" w:w="2736"/>
+          </w:tcPr>
+          <w:p>
             <w:r>
               <w:rPr>
                 <w:rFonts w:ascii="Calibri" w:hAnsi="Calibri"/>
@@ -2534,12 +2262,30 @@
             </w:r>
           </w:p>
         </w:tc>
+      </w:tr>
+      <w:tr>
         <w:tc>
           <w:tcPr>
             <w:tcW w:type="dxa" w:w="1440"/>
+            <w:shd w:val="clear" w:color="auto" w:fill="E7E6E6"/>
           </w:tcPr>
           <w:p>
-            <w:r/>
+            <w:r>
+              <w:rPr>
+                <w:rFonts w:ascii="Calibri" w:hAnsi="Calibri"/>
+                <w:b/>
+                <w:i w:val="0"/>
+                <w:sz w:val="20"/>
+              </w:rPr>
+              <w:t>Técnica</w:t>
+            </w:r>
+          </w:p>
+        </w:tc>
+        <w:tc>
+          <w:tcPr>
+            <w:tcW w:type="dxa" w:w="3024"/>
+          </w:tcPr>
+          <w:p>
             <w:r>
               <w:rPr>
                 <w:rFonts w:ascii="Calibri" w:hAnsi="Calibri"/>
@@ -2547,7 +2293,40 @@
                 <w:i w:val="0"/>
                 <w:sz w:val="20"/>
               </w:rPr>
-              <w:t>Baixa</w:t>
+              <w:t>Tour pela aplicação</w:t>
+            </w:r>
+          </w:p>
+        </w:tc>
+        <w:tc>
+          <w:tcPr>
+            <w:tcW w:type="dxa" w:w="1440"/>
+            <w:shd w:val="clear" w:color="auto" w:fill="E7E6E6"/>
+          </w:tcPr>
+          <w:p>
+            <w:r>
+              <w:rPr>
+                <w:rFonts w:ascii="Calibri" w:hAnsi="Calibri"/>
+                <w:b/>
+                <w:i w:val="0"/>
+                <w:sz w:val="20"/>
+              </w:rPr>
+              <w:t>Status</w:t>
+            </w:r>
+          </w:p>
+        </w:tc>
+        <w:tc>
+          <w:tcPr>
+            <w:tcW w:type="dxa" w:w="2736"/>
+          </w:tcPr>
+          <w:p>
+            <w:r>
+              <w:rPr>
+                <w:rFonts w:ascii="Calibri" w:hAnsi="Calibri"/>
+                <w:b w:val="0"/>
+                <w:i w:val="0"/>
+                <w:sz w:val="20"/>
+              </w:rPr>
+              <w:t>Novo</w:t>
             </w:r>
           </w:p>
         </w:tc>
@@ -2558,8 +2337,1188 @@
         <w:spacing w:after="80"/>
       </w:pPr>
     </w:p>
+    <w:p>
+      <w:pPr>
+        <w:spacing w:after="120"/>
+      </w:pPr>
+      <w:r>
+        <w:rPr>
+          <w:rFonts w:ascii="Calibri" w:hAnsi="Calibri"/>
+          <w:b/>
+          <w:i w:val="0"/>
+          <w:sz w:val="21"/>
+        </w:rPr>
+        <w:t xml:space="preserve">Descrição: </w:t>
+      </w:r>
+      <w:r>
+        <w:t>Na listagem de produtos, todos os itens aparecem com a mesma imagem de um cachorro, que não corresponde a nenhum deles.</w:t>
+      </w:r>
+    </w:p>
+    <w:p>
+      <w:pPr>
+        <w:spacing w:after="120"/>
+      </w:pPr>
+      <w:r>
+        <w:rPr>
+          <w:rFonts w:ascii="Calibri" w:hAnsi="Calibri"/>
+          <w:b/>
+          <w:i w:val="0"/>
+          <w:sz w:val="21"/>
+        </w:rPr>
+        <w:t xml:space="preserve">Pré-condição: </w:t>
+      </w:r>
+      <w:r>
+        <w:t>Usuário autenticado com problem_user; página de produtos aberta.</w:t>
+      </w:r>
+    </w:p>
+    <w:p>
+      <w:r>
+        <w:rPr>
+          <w:rFonts w:ascii="Calibri" w:hAnsi="Calibri"/>
+          <w:b/>
+          <w:i w:val="0"/>
+          <w:sz w:val="21"/>
+        </w:rPr>
+        <w:t>Passos para reprodução</w:t>
+      </w:r>
+    </w:p>
+    <w:p>
+      <w:pPr>
+        <w:pStyle w:val="ListNumber"/>
+      </w:pPr>
+      <w:r>
+        <w:rPr>
+          <w:rFonts w:ascii="Calibri" w:hAnsi="Calibri"/>
+          <w:b w:val="0"/>
+          <w:i w:val="0"/>
+          <w:sz w:val="21"/>
+        </w:rPr>
+        <w:t>Fazer login com problem_user.</w:t>
+      </w:r>
+    </w:p>
+    <w:p>
+      <w:pPr>
+        <w:pStyle w:val="ListNumber"/>
+      </w:pPr>
+      <w:r>
+        <w:rPr>
+          <w:rFonts w:ascii="Calibri" w:hAnsi="Calibri"/>
+          <w:b w:val="0"/>
+          <w:i w:val="0"/>
+          <w:sz w:val="21"/>
+        </w:rPr>
+        <w:t>Acessar a página de produtos.</w:t>
+      </w:r>
+    </w:p>
+    <w:p>
+      <w:pPr>
+        <w:pStyle w:val="ListNumber"/>
+      </w:pPr>
+      <w:r>
+        <w:rPr>
+          <w:rFonts w:ascii="Calibri" w:hAnsi="Calibri"/>
+          <w:b w:val="0"/>
+          <w:i w:val="0"/>
+          <w:sz w:val="21"/>
+        </w:rPr>
+        <w:t>Percorrer a listagem e comparar nome e descrição de cada produto com a imagem exibida.</w:t>
+      </w:r>
+    </w:p>
+    <w:p>
+      <w:pPr>
+        <w:spacing w:after="120"/>
+      </w:pPr>
+      <w:r>
+        <w:rPr>
+          <w:rFonts w:ascii="Calibri" w:hAnsi="Calibri"/>
+          <w:b/>
+          <w:i w:val="0"/>
+          <w:sz w:val="21"/>
+        </w:rPr>
+        <w:t xml:space="preserve">Resultado esperado: </w:t>
+      </w:r>
+      <w:r>
+        <w:t>Cada produto deveria exibir uma imagem correspondente ao seu nome e à sua descrição.</w:t>
+      </w:r>
+    </w:p>
+    <w:p>
+      <w:pPr>
+        <w:spacing w:after="120"/>
+      </w:pPr>
+      <w:r>
+        <w:rPr>
+          <w:rFonts w:ascii="Calibri" w:hAnsi="Calibri"/>
+          <w:b/>
+          <w:i w:val="0"/>
+          <w:sz w:val="21"/>
+        </w:rPr>
+        <w:t xml:space="preserve">Resultado obtido: </w:t>
+      </w:r>
+      <w:r>
+        <w:t>Backpack, Bike Light, Bolt T-Shirt, Fleece Jacket e os demais itens aparecem com a mesma foto de um cachorro.</w:t>
+      </w:r>
+    </w:p>
+    <w:p>
+      <w:r>
+        <w:rPr>
+          <w:rFonts w:ascii="Calibri" w:hAnsi="Calibri"/>
+          <w:b/>
+          <w:i w:val="0"/>
+          <w:sz w:val="21"/>
+        </w:rPr>
+        <w:t>Evidências</w:t>
+      </w:r>
+    </w:p>
+    <w:p>
+      <w:pPr>
+        <w:jc w:val="center"/>
+      </w:pPr>
+      <w:r>
+        <w:drawing>
+          <wp:inline xmlns:a="http://schemas.openxmlformats.org/drawingml/2006/main" xmlns:pic="http://schemas.openxmlformats.org/drawingml/2006/picture">
+            <wp:extent cx="3931920" cy="2211705"/>
+            <wp:docPr id="8" name="Picture 8"/>
+            <wp:cNvGraphicFramePr>
+              <a:graphicFrameLocks noChangeAspect="1"/>
+            </wp:cNvGraphicFramePr>
+            <a:graphic>
+              <a:graphicData uri="http://schemas.openxmlformats.org/drawingml/2006/picture">
+                <pic:pic>
+                  <pic:nvPicPr>
+                    <pic:cNvPr id="0" name="p5_0.png"/>
+                    <pic:cNvPicPr/>
+                  </pic:nvPicPr>
+                  <pic:blipFill>
+                    <a:blip r:embed="rId16"/>
+                    <a:stretch>
+                      <a:fillRect/>
+                    </a:stretch>
+                  </pic:blipFill>
+                  <pic:spPr>
+                    <a:xfrm>
+                      <a:off x="0" y="0"/>
+                      <a:ext cx="3931920" cy="2211705"/>
+                    </a:xfrm>
+                    <a:prstGeom prst="rect"/>
+                  </pic:spPr>
+                </pic:pic>
+              </a:graphicData>
+            </a:graphic>
+          </wp:inline>
+        </w:drawing>
+      </w:r>
+    </w:p>
+    <w:p>
+      <w:pPr>
+        <w:jc w:val="center"/>
+      </w:pPr>
+      <w:r>
+        <w:rPr>
+          <w:rFonts w:ascii="Calibri" w:hAnsi="Calibri"/>
+          <w:b w:val="0"/>
+          <w:i/>
+          <w:color w:val="595959"/>
+          <w:sz w:val="18"/>
+        </w:rPr>
+        <w:t>Figura 6 – Login realizado com o usuário problem_user.</w:t>
+      </w:r>
+    </w:p>
+    <w:p>
+      <w:pPr>
+        <w:jc w:val="center"/>
+      </w:pPr>
+      <w:r>
+        <w:drawing>
+          <wp:inline xmlns:a="http://schemas.openxmlformats.org/drawingml/2006/main" xmlns:pic="http://schemas.openxmlformats.org/drawingml/2006/picture">
+            <wp:extent cx="3931920" cy="2211705"/>
+            <wp:docPr id="9" name="Picture 9"/>
+            <wp:cNvGraphicFramePr>
+              <a:graphicFrameLocks noChangeAspect="1"/>
+            </wp:cNvGraphicFramePr>
+            <a:graphic>
+              <a:graphicData uri="http://schemas.openxmlformats.org/drawingml/2006/picture">
+                <pic:pic>
+                  <pic:nvPicPr>
+                    <pic:cNvPr id="0" name="p5_1.png"/>
+                    <pic:cNvPicPr/>
+                  </pic:nvPicPr>
+                  <pic:blipFill>
+                    <a:blip r:embed="rId17"/>
+                    <a:stretch>
+                      <a:fillRect/>
+                    </a:stretch>
+                  </pic:blipFill>
+                  <pic:spPr>
+                    <a:xfrm>
+                      <a:off x="0" y="0"/>
+                      <a:ext cx="3931920" cy="2211705"/>
+                    </a:xfrm>
+                    <a:prstGeom prst="rect"/>
+                  </pic:spPr>
+                </pic:pic>
+              </a:graphicData>
+            </a:graphic>
+          </wp:inline>
+        </w:drawing>
+      </w:r>
+    </w:p>
+    <w:p>
+      <w:pPr>
+        <w:jc w:val="center"/>
+      </w:pPr>
+      <w:r>
+        <w:rPr>
+          <w:rFonts w:ascii="Calibri" w:hAnsi="Calibri"/>
+          <w:b w:val="0"/>
+          <w:i/>
+          <w:color w:val="595959"/>
+          <w:sz w:val="18"/>
+        </w:rPr>
+        <w:t>Figura 7 – Listagem de produtos com a mesma imagem em todos os itens.</w:t>
+      </w:r>
+    </w:p>
+    <w:p>
+      <w:pPr>
+        <w:spacing w:before="200" w:after="80"/>
+      </w:pPr>
+      <w:r>
+        <w:rPr>
+          <w:rFonts w:ascii="Calibri" w:hAnsi="Calibri"/>
+          <w:b/>
+          <w:i w:val="0"/>
+          <w:sz w:val="23"/>
+        </w:rPr>
+        <w:t>BUG-004 — Descrição do produto não é exibida na página de detalhes</w:t>
+      </w:r>
+    </w:p>
+    <w:tbl>
+      <w:tblPr>
+        <w:tblW w:type="auto" w:w="0"/>
+        <w:tblLook w:firstColumn="1" w:firstRow="1" w:lastColumn="0" w:lastRow="0" w:noHBand="0" w:noVBand="1" w:val="04A0"/>
+        <w:tblBorders>
+          <w:top w:val="single" w:sz="4" w:space="0" w:color="BFBFBF"/>
+          <w:left w:val="single" w:sz="4" w:space="0" w:color="BFBFBF"/>
+          <w:bottom w:val="single" w:sz="4" w:space="0" w:color="BFBFBF"/>
+          <w:right w:val="single" w:sz="4" w:space="0" w:color="BFBFBF"/>
+          <w:insideH w:val="single" w:sz="4" w:space="0" w:color="BFBFBF"/>
+          <w:insideV w:val="single" w:sz="4" w:space="0" w:color="BFBFBF"/>
+        </w:tblBorders>
+      </w:tblPr>
+      <w:tblGrid>
+        <w:gridCol w:w="2493"/>
+        <w:gridCol w:w="2493"/>
+        <w:gridCol w:w="2493"/>
+        <w:gridCol w:w="2493"/>
+      </w:tblGrid>
+      <w:tr>
+        <w:tc>
+          <w:tcPr>
+            <w:tcW w:type="dxa" w:w="1440"/>
+            <w:shd w:val="clear" w:color="auto" w:fill="E7E6E6"/>
+          </w:tcPr>
+          <w:p>
+            <w:r>
+              <w:rPr>
+                <w:rFonts w:ascii="Calibri" w:hAnsi="Calibri"/>
+                <w:b/>
+                <w:i w:val="0"/>
+                <w:sz w:val="20"/>
+              </w:rPr>
+              <w:t>Usuário</w:t>
+            </w:r>
+          </w:p>
+        </w:tc>
+        <w:tc>
+          <w:tcPr>
+            <w:tcW w:type="dxa" w:w="3024"/>
+          </w:tcPr>
+          <w:p>
+            <w:r>
+              <w:rPr>
+                <w:rFonts w:ascii="Calibri" w:hAnsi="Calibri"/>
+                <w:b w:val="0"/>
+                <w:i w:val="0"/>
+                <w:sz w:val="20"/>
+              </w:rPr>
+              <w:t>error_user</w:t>
+            </w:r>
+          </w:p>
+        </w:tc>
+        <w:tc>
+          <w:tcPr>
+            <w:tcW w:type="dxa" w:w="1440"/>
+            <w:shd w:val="clear" w:color="auto" w:fill="E7E6E6"/>
+          </w:tcPr>
+          <w:p>
+            <w:r>
+              <w:rPr>
+                <w:rFonts w:ascii="Calibri" w:hAnsi="Calibri"/>
+                <w:b/>
+                <w:i w:val="0"/>
+                <w:sz w:val="20"/>
+              </w:rPr>
+              <w:t>Severidade</w:t>
+            </w:r>
+          </w:p>
+        </w:tc>
+        <w:tc>
+          <w:tcPr>
+            <w:tcW w:type="dxa" w:w="2736"/>
+          </w:tcPr>
+          <w:p>
+            <w:r>
+              <w:rPr>
+                <w:rFonts w:ascii="Calibri" w:hAnsi="Calibri"/>
+                <w:b w:val="0"/>
+                <w:i w:val="0"/>
+                <w:sz w:val="20"/>
+              </w:rPr>
+              <w:t>Média</w:t>
+            </w:r>
+          </w:p>
+        </w:tc>
+      </w:tr>
+      <w:tr>
+        <w:tc>
+          <w:tcPr>
+            <w:tcW w:type="dxa" w:w="1440"/>
+            <w:shd w:val="clear" w:color="auto" w:fill="E7E6E6"/>
+          </w:tcPr>
+          <w:p>
+            <w:r>
+              <w:rPr>
+                <w:rFonts w:ascii="Calibri" w:hAnsi="Calibri"/>
+                <w:b/>
+                <w:i w:val="0"/>
+                <w:sz w:val="20"/>
+              </w:rPr>
+              <w:t>Ambiente</w:t>
+            </w:r>
+          </w:p>
+        </w:tc>
+        <w:tc>
+          <w:tcPr>
+            <w:tcW w:type="dxa" w:w="3024"/>
+          </w:tcPr>
+          <w:p>
+            <w:r>
+              <w:rPr>
+                <w:rFonts w:ascii="Calibri" w:hAnsi="Calibri"/>
+                <w:b w:val="0"/>
+                <w:i w:val="0"/>
+                <w:sz w:val="20"/>
+              </w:rPr>
+              <w:t>Sauce Demo / Google Chrome / Windows</w:t>
+            </w:r>
+          </w:p>
+        </w:tc>
+        <w:tc>
+          <w:tcPr>
+            <w:tcW w:type="dxa" w:w="1440"/>
+            <w:shd w:val="clear" w:color="auto" w:fill="E7E6E6"/>
+          </w:tcPr>
+          <w:p>
+            <w:r>
+              <w:rPr>
+                <w:rFonts w:ascii="Calibri" w:hAnsi="Calibri"/>
+                <w:b/>
+                <w:i w:val="0"/>
+                <w:sz w:val="20"/>
+              </w:rPr>
+              <w:t>Prioridade</w:t>
+            </w:r>
+          </w:p>
+        </w:tc>
+        <w:tc>
+          <w:tcPr>
+            <w:tcW w:type="dxa" w:w="2736"/>
+          </w:tcPr>
+          <w:p>
+            <w:r>
+              <w:rPr>
+                <w:rFonts w:ascii="Calibri" w:hAnsi="Calibri"/>
+                <w:b w:val="0"/>
+                <w:i w:val="0"/>
+                <w:sz w:val="20"/>
+              </w:rPr>
+              <w:t>Média</w:t>
+            </w:r>
+          </w:p>
+        </w:tc>
+      </w:tr>
+      <w:tr>
+        <w:tc>
+          <w:tcPr>
+            <w:tcW w:type="dxa" w:w="1440"/>
+            <w:shd w:val="clear" w:color="auto" w:fill="E7E6E6"/>
+          </w:tcPr>
+          <w:p>
+            <w:r>
+              <w:rPr>
+                <w:rFonts w:ascii="Calibri" w:hAnsi="Calibri"/>
+                <w:b/>
+                <w:i w:val="0"/>
+                <w:sz w:val="20"/>
+              </w:rPr>
+              <w:t>Técnica</w:t>
+            </w:r>
+          </w:p>
+        </w:tc>
+        <w:tc>
+          <w:tcPr>
+            <w:tcW w:type="dxa" w:w="3024"/>
+          </w:tcPr>
+          <w:p>
+            <w:r>
+              <w:rPr>
+                <w:rFonts w:ascii="Calibri" w:hAnsi="Calibri"/>
+                <w:b w:val="0"/>
+                <w:i w:val="0"/>
+                <w:sz w:val="20"/>
+              </w:rPr>
+              <w:t>Tour pela aplicação</w:t>
+            </w:r>
+          </w:p>
+        </w:tc>
+        <w:tc>
+          <w:tcPr>
+            <w:tcW w:type="dxa" w:w="1440"/>
+            <w:shd w:val="clear" w:color="auto" w:fill="E7E6E6"/>
+          </w:tcPr>
+          <w:p>
+            <w:r>
+              <w:rPr>
+                <w:rFonts w:ascii="Calibri" w:hAnsi="Calibri"/>
+                <w:b/>
+                <w:i w:val="0"/>
+                <w:sz w:val="20"/>
+              </w:rPr>
+              <w:t>Status</w:t>
+            </w:r>
+          </w:p>
+        </w:tc>
+        <w:tc>
+          <w:tcPr>
+            <w:tcW w:type="dxa" w:w="2736"/>
+          </w:tcPr>
+          <w:p>
+            <w:r>
+              <w:rPr>
+                <w:rFonts w:ascii="Calibri" w:hAnsi="Calibri"/>
+                <w:b w:val="0"/>
+                <w:i w:val="0"/>
+                <w:sz w:val="20"/>
+              </w:rPr>
+              <w:t>Novo</w:t>
+            </w:r>
+          </w:p>
+        </w:tc>
+      </w:tr>
+    </w:tbl>
+    <w:p>
+      <w:pPr>
+        <w:spacing w:after="80"/>
+      </w:pPr>
+    </w:p>
+    <w:p>
+      <w:pPr>
+        <w:spacing w:after="120"/>
+      </w:pPr>
+      <w:r>
+        <w:rPr>
+          <w:rFonts w:ascii="Calibri" w:hAnsi="Calibri"/>
+          <w:b/>
+          <w:i w:val="0"/>
+          <w:sz w:val="21"/>
+        </w:rPr>
+        <w:t xml:space="preserve">Descrição: </w:t>
+      </w:r>
+      <w:r>
+        <w:t>Ao abrir os detalhes de um produto, a página mostra nome, preço e botão de compra, mas não exibe a descrição.</w:t>
+      </w:r>
+    </w:p>
+    <w:p>
+      <w:pPr>
+        <w:spacing w:after="120"/>
+      </w:pPr>
+      <w:r>
+        <w:rPr>
+          <w:rFonts w:ascii="Calibri" w:hAnsi="Calibri"/>
+          <w:b/>
+          <w:i w:val="0"/>
+          <w:sz w:val="21"/>
+        </w:rPr>
+        <w:t xml:space="preserve">Pré-condição: </w:t>
+      </w:r>
+      <w:r>
+        <w:t>Usuário autenticado com error_user; página de produtos aberta.</w:t>
+      </w:r>
+    </w:p>
+    <w:p>
+      <w:r>
+        <w:rPr>
+          <w:rFonts w:ascii="Calibri" w:hAnsi="Calibri"/>
+          <w:b/>
+          <w:i w:val="0"/>
+          <w:sz w:val="21"/>
+        </w:rPr>
+        <w:t>Passos para reprodução</w:t>
+      </w:r>
+    </w:p>
+    <w:p>
+      <w:pPr>
+        <w:pStyle w:val="ListNumber"/>
+      </w:pPr>
+      <w:r>
+        <w:rPr>
+          <w:rFonts w:ascii="Calibri" w:hAnsi="Calibri"/>
+          <w:b w:val="0"/>
+          <w:i w:val="0"/>
+          <w:sz w:val="21"/>
+        </w:rPr>
+        <w:t>Fazer login com error_user e acessar a página de produtos.</w:t>
+      </w:r>
+    </w:p>
+    <w:p>
+      <w:pPr>
+        <w:pStyle w:val="ListNumber"/>
+      </w:pPr>
+      <w:r>
+        <w:rPr>
+          <w:rFonts w:ascii="Calibri" w:hAnsi="Calibri"/>
+          <w:b w:val="0"/>
+          <w:i w:val="0"/>
+          <w:sz w:val="21"/>
+        </w:rPr>
+        <w:t>Selecionar o produto Sauce Labs Backpack.</w:t>
+      </w:r>
+    </w:p>
+    <w:p>
+      <w:pPr>
+        <w:pStyle w:val="ListNumber"/>
+      </w:pPr>
+      <w:r>
+        <w:rPr>
+          <w:rFonts w:ascii="Calibri" w:hAnsi="Calibri"/>
+          <w:b w:val="0"/>
+          <w:i w:val="0"/>
+          <w:sz w:val="21"/>
+        </w:rPr>
+        <w:t>Observar as informações da página de detalhes.</w:t>
+      </w:r>
+    </w:p>
+    <w:p>
+      <w:pPr>
+        <w:spacing w:after="120"/>
+      </w:pPr>
+      <w:r>
+        <w:rPr>
+          <w:rFonts w:ascii="Calibri" w:hAnsi="Calibri"/>
+          <w:b/>
+          <w:i w:val="0"/>
+          <w:sz w:val="21"/>
+        </w:rPr>
+        <w:t xml:space="preserve">Resultado esperado: </w:t>
+      </w:r>
+      <w:r>
+        <w:t>A página de detalhes deveria apresentar as informações do produto, incluindo a descrição.</w:t>
+      </w:r>
+    </w:p>
+    <w:p>
+      <w:pPr>
+        <w:spacing w:after="120"/>
+      </w:pPr>
+      <w:r>
+        <w:rPr>
+          <w:rFonts w:ascii="Calibri" w:hAnsi="Calibri"/>
+          <w:b/>
+          <w:i w:val="0"/>
+          <w:sz w:val="21"/>
+        </w:rPr>
+        <w:t xml:space="preserve">Resultado obtido: </w:t>
+      </w:r>
+      <w:r>
+        <w:t>A página exibe o nome Sauce Labs Backpack, o preço $29.99 e o botão Add to cart, mas não apresenta a descrição.</w:t>
+      </w:r>
+    </w:p>
+    <w:p>
+      <w:r>
+        <w:rPr>
+          <w:rFonts w:ascii="Calibri" w:hAnsi="Calibri"/>
+          <w:b/>
+          <w:i w:val="0"/>
+          <w:sz w:val="21"/>
+        </w:rPr>
+        <w:t>Evidências</w:t>
+      </w:r>
+    </w:p>
+    <w:p>
+      <w:pPr>
+        <w:jc w:val="center"/>
+      </w:pPr>
+      <w:r>
+        <w:drawing>
+          <wp:inline xmlns:a="http://schemas.openxmlformats.org/drawingml/2006/main" xmlns:pic="http://schemas.openxmlformats.org/drawingml/2006/picture">
+            <wp:extent cx="3931920" cy="2211705"/>
+            <wp:docPr id="10" name="Picture 10"/>
+            <wp:cNvGraphicFramePr>
+              <a:graphicFrameLocks noChangeAspect="1"/>
+            </wp:cNvGraphicFramePr>
+            <a:graphic>
+              <a:graphicData uri="http://schemas.openxmlformats.org/drawingml/2006/picture">
+                <pic:pic>
+                  <pic:nvPicPr>
+                    <pic:cNvPr id="0" name="p6_0.png"/>
+                    <pic:cNvPicPr/>
+                  </pic:nvPicPr>
+                  <pic:blipFill>
+                    <a:blip r:embed="rId18"/>
+                    <a:stretch>
+                      <a:fillRect/>
+                    </a:stretch>
+                  </pic:blipFill>
+                  <pic:spPr>
+                    <a:xfrm>
+                      <a:off x="0" y="0"/>
+                      <a:ext cx="3931920" cy="2211705"/>
+                    </a:xfrm>
+                    <a:prstGeom prst="rect"/>
+                  </pic:spPr>
+                </pic:pic>
+              </a:graphicData>
+            </a:graphic>
+          </wp:inline>
+        </w:drawing>
+      </w:r>
+    </w:p>
+    <w:p>
+      <w:pPr>
+        <w:jc w:val="center"/>
+      </w:pPr>
+      <w:r>
+        <w:rPr>
+          <w:rFonts w:ascii="Calibri" w:hAnsi="Calibri"/>
+          <w:b w:val="0"/>
+          <w:i/>
+          <w:color w:val="595959"/>
+          <w:sz w:val="18"/>
+        </w:rPr>
+        <w:t>Figura 8 – Página de detalhes da mochila sem o texto de descrição.</w:t>
+      </w:r>
+    </w:p>
+    <w:p>
+      <w:pPr>
+        <w:spacing w:before="200" w:after="80"/>
+      </w:pPr>
+      <w:r>
+        <w:rPr>
+          <w:rFonts w:ascii="Calibri" w:hAnsi="Calibri"/>
+          <w:b/>
+          <w:i w:val="0"/>
+          <w:sz w:val="23"/>
+        </w:rPr>
+        <w:t>BUG-005 — Preços, imagem e layout inconsistentes na listagem</w:t>
+      </w:r>
+    </w:p>
+    <w:tbl>
+      <w:tblPr>
+        <w:tblW w:type="auto" w:w="0"/>
+        <w:tblLook w:firstColumn="1" w:firstRow="1" w:lastColumn="0" w:lastRow="0" w:noHBand="0" w:noVBand="1" w:val="04A0"/>
+        <w:tblBorders>
+          <w:top w:val="single" w:sz="4" w:space="0" w:color="BFBFBF"/>
+          <w:left w:val="single" w:sz="4" w:space="0" w:color="BFBFBF"/>
+          <w:bottom w:val="single" w:sz="4" w:space="0" w:color="BFBFBF"/>
+          <w:right w:val="single" w:sz="4" w:space="0" w:color="BFBFBF"/>
+          <w:insideH w:val="single" w:sz="4" w:space="0" w:color="BFBFBF"/>
+          <w:insideV w:val="single" w:sz="4" w:space="0" w:color="BFBFBF"/>
+        </w:tblBorders>
+      </w:tblPr>
+      <w:tblGrid>
+        <w:gridCol w:w="2493"/>
+        <w:gridCol w:w="2493"/>
+        <w:gridCol w:w="2493"/>
+        <w:gridCol w:w="2493"/>
+      </w:tblGrid>
+      <w:tr>
+        <w:tc>
+          <w:tcPr>
+            <w:tcW w:type="dxa" w:w="1440"/>
+            <w:shd w:val="clear" w:color="auto" w:fill="E7E6E6"/>
+          </w:tcPr>
+          <w:p>
+            <w:r>
+              <w:rPr>
+                <w:rFonts w:ascii="Calibri" w:hAnsi="Calibri"/>
+                <w:b/>
+                <w:i w:val="0"/>
+                <w:sz w:val="20"/>
+              </w:rPr>
+              <w:t>Usuário</w:t>
+            </w:r>
+          </w:p>
+        </w:tc>
+        <w:tc>
+          <w:tcPr>
+            <w:tcW w:type="dxa" w:w="3024"/>
+          </w:tcPr>
+          <w:p>
+            <w:r>
+              <w:rPr>
+                <w:rFonts w:ascii="Calibri" w:hAnsi="Calibri"/>
+                <w:b w:val="0"/>
+                <w:i w:val="0"/>
+                <w:sz w:val="20"/>
+              </w:rPr>
+              <w:t>visual_user</w:t>
+            </w:r>
+          </w:p>
+        </w:tc>
+        <w:tc>
+          <w:tcPr>
+            <w:tcW w:type="dxa" w:w="1440"/>
+            <w:shd w:val="clear" w:color="auto" w:fill="E7E6E6"/>
+          </w:tcPr>
+          <w:p>
+            <w:r>
+              <w:rPr>
+                <w:rFonts w:ascii="Calibri" w:hAnsi="Calibri"/>
+                <w:b/>
+                <w:i w:val="0"/>
+                <w:sz w:val="20"/>
+              </w:rPr>
+              <w:t>Severidade</w:t>
+            </w:r>
+          </w:p>
+        </w:tc>
+        <w:tc>
+          <w:tcPr>
+            <w:tcW w:type="dxa" w:w="2736"/>
+          </w:tcPr>
+          <w:p>
+            <w:r>
+              <w:rPr>
+                <w:rFonts w:ascii="Calibri" w:hAnsi="Calibri"/>
+                <w:b w:val="0"/>
+                <w:i w:val="0"/>
+                <w:sz w:val="20"/>
+              </w:rPr>
+              <w:t>Média</w:t>
+            </w:r>
+          </w:p>
+        </w:tc>
+      </w:tr>
+      <w:tr>
+        <w:tc>
+          <w:tcPr>
+            <w:tcW w:type="dxa" w:w="1440"/>
+            <w:shd w:val="clear" w:color="auto" w:fill="E7E6E6"/>
+          </w:tcPr>
+          <w:p>
+            <w:r>
+              <w:rPr>
+                <w:rFonts w:ascii="Calibri" w:hAnsi="Calibri"/>
+                <w:b/>
+                <w:i w:val="0"/>
+                <w:sz w:val="20"/>
+              </w:rPr>
+              <w:t>Ambiente</w:t>
+            </w:r>
+          </w:p>
+        </w:tc>
+        <w:tc>
+          <w:tcPr>
+            <w:tcW w:type="dxa" w:w="3024"/>
+          </w:tcPr>
+          <w:p>
+            <w:r>
+              <w:rPr>
+                <w:rFonts w:ascii="Calibri" w:hAnsi="Calibri"/>
+                <w:b w:val="0"/>
+                <w:i w:val="0"/>
+                <w:sz w:val="20"/>
+              </w:rPr>
+              <w:t>Sauce Demo / Google Chrome / Windows</w:t>
+            </w:r>
+          </w:p>
+        </w:tc>
+        <w:tc>
+          <w:tcPr>
+            <w:tcW w:type="dxa" w:w="1440"/>
+            <w:shd w:val="clear" w:color="auto" w:fill="E7E6E6"/>
+          </w:tcPr>
+          <w:p>
+            <w:r>
+              <w:rPr>
+                <w:rFonts w:ascii="Calibri" w:hAnsi="Calibri"/>
+                <w:b/>
+                <w:i w:val="0"/>
+                <w:sz w:val="20"/>
+              </w:rPr>
+              <w:t>Prioridade</w:t>
+            </w:r>
+          </w:p>
+        </w:tc>
+        <w:tc>
+          <w:tcPr>
+            <w:tcW w:type="dxa" w:w="2736"/>
+          </w:tcPr>
+          <w:p>
+            <w:r>
+              <w:rPr>
+                <w:rFonts w:ascii="Calibri" w:hAnsi="Calibri"/>
+                <w:b w:val="0"/>
+                <w:i w:val="0"/>
+                <w:sz w:val="20"/>
+              </w:rPr>
+              <w:t>Média</w:t>
+            </w:r>
+          </w:p>
+        </w:tc>
+      </w:tr>
+      <w:tr>
+        <w:tc>
+          <w:tcPr>
+            <w:tcW w:type="dxa" w:w="1440"/>
+            <w:shd w:val="clear" w:color="auto" w:fill="E7E6E6"/>
+          </w:tcPr>
+          <w:p>
+            <w:r>
+              <w:rPr>
+                <w:rFonts w:ascii="Calibri" w:hAnsi="Calibri"/>
+                <w:b/>
+                <w:i w:val="0"/>
+                <w:sz w:val="20"/>
+              </w:rPr>
+              <w:t>Técnica</w:t>
+            </w:r>
+          </w:p>
+        </w:tc>
+        <w:tc>
+          <w:tcPr>
+            <w:tcW w:type="dxa" w:w="3024"/>
+          </w:tcPr>
+          <w:p>
+            <w:r>
+              <w:rPr>
+                <w:rFonts w:ascii="Calibri" w:hAnsi="Calibri"/>
+                <w:b w:val="0"/>
+                <w:i w:val="0"/>
+                <w:sz w:val="20"/>
+              </w:rPr>
+              <w:t>Tour pela aplicação e comparação entre perfis</w:t>
+            </w:r>
+          </w:p>
+        </w:tc>
+        <w:tc>
+          <w:tcPr>
+            <w:tcW w:type="dxa" w:w="1440"/>
+            <w:shd w:val="clear" w:color="auto" w:fill="E7E6E6"/>
+          </w:tcPr>
+          <w:p>
+            <w:r>
+              <w:rPr>
+                <w:rFonts w:ascii="Calibri" w:hAnsi="Calibri"/>
+                <w:b/>
+                <w:i w:val="0"/>
+                <w:sz w:val="20"/>
+              </w:rPr>
+              <w:t>Status</w:t>
+            </w:r>
+          </w:p>
+        </w:tc>
+        <w:tc>
+          <w:tcPr>
+            <w:tcW w:type="dxa" w:w="2736"/>
+          </w:tcPr>
+          <w:p>
+            <w:r>
+              <w:rPr>
+                <w:rFonts w:ascii="Calibri" w:hAnsi="Calibri"/>
+                <w:b w:val="0"/>
+                <w:i w:val="0"/>
+                <w:sz w:val="20"/>
+              </w:rPr>
+              <w:t>Novo</w:t>
+            </w:r>
+          </w:p>
+        </w:tc>
+      </w:tr>
+    </w:tbl>
+    <w:p>
+      <w:pPr>
+        <w:spacing w:after="80"/>
+      </w:pPr>
+    </w:p>
+    <w:p>
+      <w:pPr>
+        <w:spacing w:after="120"/>
+      </w:pPr>
+      <w:r>
+        <w:rPr>
+          <w:rFonts w:ascii="Calibri" w:hAnsi="Calibri"/>
+          <w:b/>
+          <w:i w:val="0"/>
+          <w:sz w:val="21"/>
+        </w:rPr>
+        <w:t xml:space="preserve">Descrição: </w:t>
+      </w:r>
+      <w:r>
+        <w:t>Com o visual_user, a listagem de produtos apresenta preços diferentes dos exibidos aos demais usuários, a imagem da mochila trocada pela de um cachorro e elementos desalinhados.</w:t>
+      </w:r>
+    </w:p>
+    <w:p>
+      <w:pPr>
+        <w:spacing w:after="120"/>
+      </w:pPr>
+      <w:r>
+        <w:rPr>
+          <w:rFonts w:ascii="Calibri" w:hAnsi="Calibri"/>
+          <w:b/>
+          <w:i w:val="0"/>
+          <w:sz w:val="21"/>
+        </w:rPr>
+        <w:t xml:space="preserve">Pré-condição: </w:t>
+      </w:r>
+      <w:r>
+        <w:t>Usuário autenticado com visual_user; página de produtos aberta.</w:t>
+      </w:r>
+    </w:p>
+    <w:p>
+      <w:r>
+        <w:rPr>
+          <w:rFonts w:ascii="Calibri" w:hAnsi="Calibri"/>
+          <w:b/>
+          <w:i w:val="0"/>
+          <w:sz w:val="21"/>
+        </w:rPr>
+        <w:t>Passos para reprodução</w:t>
+      </w:r>
+    </w:p>
+    <w:p>
+      <w:pPr>
+        <w:pStyle w:val="ListNumber"/>
+      </w:pPr>
+      <w:r>
+        <w:rPr>
+          <w:rFonts w:ascii="Calibri" w:hAnsi="Calibri"/>
+          <w:b w:val="0"/>
+          <w:i w:val="0"/>
+          <w:sz w:val="21"/>
+        </w:rPr>
+        <w:t>Fazer login com visual_user.</w:t>
+      </w:r>
+    </w:p>
+    <w:p>
+      <w:pPr>
+        <w:pStyle w:val="ListNumber"/>
+      </w:pPr>
+      <w:r>
+        <w:rPr>
+          <w:rFonts w:ascii="Calibri" w:hAnsi="Calibri"/>
+          <w:b w:val="0"/>
+          <w:i w:val="0"/>
+          <w:sz w:val="21"/>
+        </w:rPr>
+        <w:t>Acessar a página de produtos.</w:t>
+      </w:r>
+    </w:p>
+    <w:p>
+      <w:pPr>
+        <w:pStyle w:val="ListNumber"/>
+      </w:pPr>
+      <w:r>
+        <w:rPr>
+          <w:rFonts w:ascii="Calibri" w:hAnsi="Calibri"/>
+          <w:b w:val="0"/>
+          <w:i w:val="0"/>
+          <w:sz w:val="21"/>
+        </w:rPr>
+        <w:t>Comparar preços, imagens e alinhamento com a listagem exibida para os outros usuários.</w:t>
+      </w:r>
+    </w:p>
+    <w:p>
+      <w:pPr>
+        <w:spacing w:after="120"/>
+      </w:pPr>
+      <w:r>
+        <w:rPr>
+          <w:rFonts w:ascii="Calibri" w:hAnsi="Calibri"/>
+          <w:b/>
+          <w:i w:val="0"/>
+          <w:sz w:val="21"/>
+        </w:rPr>
+        <w:t xml:space="preserve">Resultado esperado: </w:t>
+      </w:r>
+      <w:r>
+        <w:t>Preços iguais aos do catálogo (Backpack $29.99, Bike Light $9.99, Bolt T-Shirt $15.99, Fleece Jacket $49.99), imagem correta em cada produto e layout alinhado.</w:t>
+      </w:r>
+    </w:p>
+    <w:p>
+      <w:pPr>
+        <w:spacing w:after="120"/>
+      </w:pPr>
+      <w:r>
+        <w:rPr>
+          <w:rFonts w:ascii="Calibri" w:hAnsi="Calibri"/>
+          <w:b/>
+          <w:i w:val="0"/>
+          <w:sz w:val="21"/>
+        </w:rPr>
+        <w:t xml:space="preserve">Resultado obtido: </w:t>
+      </w:r>
+      <w:r>
+        <w:t>Preços diferentes: Backpack $57.49, Bike Light $34.76, Bolt T-Shirt $87.58 e Fleece Jacket $1.51. O item Sauce Labs Backpack aparece com a imagem de um cachorro (os demais têm imagens corretas), o ícone do carrinho fica deslocado abaixo do cabeçalho e os títulos de Bolt T-Shirt e Fleece Jacket estão desalinhados.</w:t>
+      </w:r>
+    </w:p>
+    <w:p>
+      <w:r>
+        <w:rPr>
+          <w:rFonts w:ascii="Calibri" w:hAnsi="Calibri"/>
+          <w:b/>
+          <w:i w:val="0"/>
+          <w:sz w:val="21"/>
+        </w:rPr>
+        <w:t>Evidências</w:t>
+      </w:r>
+    </w:p>
+    <w:p>
+      <w:pPr>
+        <w:jc w:val="center"/>
+      </w:pPr>
+      <w:r>
+        <w:drawing>
+          <wp:inline xmlns:a="http://schemas.openxmlformats.org/drawingml/2006/main" xmlns:pic="http://schemas.openxmlformats.org/drawingml/2006/picture">
+            <wp:extent cx="3931920" cy="2211705"/>
+            <wp:docPr id="11" name="Picture 11"/>
+            <wp:cNvGraphicFramePr>
+              <a:graphicFrameLocks noChangeAspect="1"/>
+            </wp:cNvGraphicFramePr>
+            <a:graphic>
+              <a:graphicData uri="http://schemas.openxmlformats.org/drawingml/2006/picture">
+                <pic:pic>
+                  <pic:nvPicPr>
+                    <pic:cNvPr id="0" name="p7_0.png"/>
+                    <pic:cNvPicPr/>
+                  </pic:nvPicPr>
+                  <pic:blipFill>
+                    <a:blip r:embed="rId19"/>
+                    <a:stretch>
+                      <a:fillRect/>
+                    </a:stretch>
+                  </pic:blipFill>
+                  <pic:spPr>
+                    <a:xfrm>
+                      <a:off x="0" y="0"/>
+                      <a:ext cx="3931920" cy="2211705"/>
+                    </a:xfrm>
+                    <a:prstGeom prst="rect"/>
+                  </pic:spPr>
+                </pic:pic>
+              </a:graphicData>
+            </a:graphic>
+          </wp:inline>
+        </w:drawing>
+      </w:r>
+    </w:p>
+    <w:p>
+      <w:pPr>
+        <w:jc w:val="center"/>
+      </w:pPr>
+      <w:r>
+        <w:rPr>
+          <w:rFonts w:ascii="Calibri" w:hAnsi="Calibri"/>
+          <w:b w:val="0"/>
+          <w:i/>
+          <w:color w:val="595959"/>
+          <w:sz w:val="18"/>
+        </w:rPr>
+        <w:t>Figura 9 – Login realizado com o usuário visual_user.</w:t>
+      </w:r>
+    </w:p>
+    <w:p>
+      <w:pPr>
+        <w:jc w:val="center"/>
+      </w:pPr>
+      <w:r>
+        <w:drawing>
+          <wp:inline xmlns:a="http://schemas.openxmlformats.org/drawingml/2006/main" xmlns:pic="http://schemas.openxmlformats.org/drawingml/2006/picture">
+            <wp:extent cx="3931920" cy="2211705"/>
+            <wp:docPr id="12" name="Picture 12"/>
+            <wp:cNvGraphicFramePr>
+              <a:graphicFrameLocks noChangeAspect="1"/>
+            </wp:cNvGraphicFramePr>
+            <a:graphic>
+              <a:graphicData uri="http://schemas.openxmlformats.org/drawingml/2006/picture">
+                <pic:pic>
+                  <pic:nvPicPr>
+                    <pic:cNvPr id="0" name="p7_1.png"/>
+                    <pic:cNvPicPr/>
+                  </pic:nvPicPr>
+                  <pic:blipFill>
+                    <a:blip r:embed="rId20"/>
+                    <a:stretch>
+                      <a:fillRect/>
+                    </a:stretch>
+                  </pic:blipFill>
+                  <pic:spPr>
+                    <a:xfrm>
+                      <a:off x="0" y="0"/>
+                      <a:ext cx="3931920" cy="2211705"/>
+                    </a:xfrm>
+                    <a:prstGeom prst="rect"/>
+                  </pic:spPr>
+                </pic:pic>
+              </a:graphicData>
+            </a:graphic>
+          </wp:inline>
+        </w:drawing>
+      </w:r>
+    </w:p>
+    <w:p>
+      <w:pPr>
+        <w:jc w:val="center"/>
+      </w:pPr>
+      <w:r>
+        <w:rPr>
+          <w:rFonts w:ascii="Calibri" w:hAnsi="Calibri"/>
+          <w:b w:val="0"/>
+          <w:i/>
+          <w:color w:val="595959"/>
+          <w:sz w:val="18"/>
+        </w:rPr>
+        <w:t>Figura 10 – Listagem com preços alterados, imagem de cachorro na mochila e carrinho deslocado.</w:t>
+      </w:r>
+    </w:p>
+    <w:p>
+      <w:pPr>
+        <w:spacing w:before="200" w:after="80"/>
+      </w:pPr>
+      <w:r>
+        <w:rPr>
+          <w:rFonts w:ascii="Calibri" w:hAnsi="Calibri"/>
+          <w:b/>
+          <w:i w:val="0"/>
+          <w:sz w:val="23"/>
+        </w:rPr>
+        <w:t>Conclusão</w:t>
+      </w:r>
+    </w:p>
+    <w:p>
+      <w:pPr>
+        <w:spacing w:after="120"/>
+      </w:pPr>
+      <w:r>
+        <w:rPr>
+          <w:rFonts w:ascii="Calibri" w:hAnsi="Calibri"/>
+          <w:b w:val="0"/>
+          <w:i w:val="0"/>
+          <w:sz w:val="21"/>
+        </w:rPr>
+        <w:t>Foram registrados cinco defeitos reproduzíveis na aplicação Sauce Demo, com os usuários standard_user, problem_user, error_user e visual_user. O mais grave é o BUG-002, porque permite concluir um pedido sem produtos. Os demais afetam a validação de dados (BUG-001) e a exibição de conteúdo (BUG-003, BUG-004 e BUG-005), incluindo preços incorretos no BUG-005. Todos foram documentados com passos de reprodução, resultados esperado e obtido, severidade, prioridade e evidências, e estão com status Novo, prontos para registro e triagem.</w:t>
+      </w:r>
+    </w:p>
     <w:sectPr>
-      <w:footerReference w:type="default" r:id="rId11"/>
+      <w:footerReference w:type="default" r:id="rId21"/>
       <w:pgSz w:w="12240" w:h="15840"/>
       <w:pgMar w:top="850" w:right="1134" w:bottom="850" w:left="1134" w:header="720" w:footer="720" w:gutter="0"/>
       <w:cols w:space="720"/>

</xml_diff>